<commit_message>
docs: updatin the font style
</commit_message>
<xml_diff>
--- a/d6_dart_extras_throw_exception_and_more.docx
+++ b/d6_dart_extras_throw_exception_and_more.docx
@@ -35,33 +35,17 @@
           <w:rFonts w:cs="Calibri"/>
           <w:b/>
           <w:bCs/>
-          <w:sz w:val="30"/>
-          <w:szCs w:val="30"/>
-        </w:rPr>
-      </w:pPr>
-      <w:r>
-        <w:rPr>
-          <w:rFonts w:cs="Calibri"/>
-          <w:sz w:val="30"/>
-          <w:szCs w:val="30"/>
-        </w:rPr>
-        <w:t>Quick Tips………………………………………</w:t>
-      </w:r>
-      <w:r>
-        <w:rPr>
-          <w:rFonts w:cs="Calibri"/>
-          <w:sz w:val="30"/>
-          <w:szCs w:val="30"/>
-        </w:rPr>
-        <w:t>……</w:t>
-      </w:r>
-      <w:r>
-        <w:rPr>
-          <w:rFonts w:cs="Calibri"/>
-          <w:sz w:val="30"/>
-          <w:szCs w:val="30"/>
-        </w:rPr>
-        <w:t>………………………………2</w:t>
+          <w:sz w:val="32"/>
+          <w:szCs w:val="32"/>
+        </w:rPr>
+      </w:pPr>
+      <w:r>
+        <w:rPr>
+          <w:rFonts w:cs="Calibri"/>
+          <w:sz w:val="32"/>
+          <w:szCs w:val="32"/>
+        </w:rPr>
+        <w:t>Quick Tips</w:t>
       </w:r>
     </w:p>
     <w:p>
@@ -73,10 +57,8 @@
         </w:numPr>
         <w:rPr>
           <w:rFonts w:cs="Calibri"/>
-          <w:b/>
-          <w:bCs/>
-          <w:sz w:val="30"/>
-          <w:szCs w:val="30"/>
+          <w:sz w:val="32"/>
+          <w:szCs w:val="32"/>
         </w:rPr>
       </w:pPr>
       <w:proofErr w:type="gramStart"/>
@@ -85,8 +67,8 @@
           <w:rFonts w:cs="Calibri"/>
           <w:b/>
           <w:bCs/>
-          <w:sz w:val="30"/>
-          <w:szCs w:val="30"/>
+          <w:sz w:val="32"/>
+          <w:szCs w:val="32"/>
         </w:rPr>
         <w:t>map(</w:t>
       </w:r>
@@ -96,42 +78,18 @@
           <w:rFonts w:cs="Calibri"/>
           <w:b/>
           <w:bCs/>
-          <w:sz w:val="30"/>
-          <w:szCs w:val="30"/>
+          <w:sz w:val="32"/>
+          <w:szCs w:val="32"/>
         </w:rPr>
         <w:t>)</w:t>
       </w:r>
       <w:r>
         <w:rPr>
           <w:rFonts w:cs="Calibri"/>
-          <w:sz w:val="30"/>
-          <w:szCs w:val="30"/>
-        </w:rPr>
-        <w:t xml:space="preserve"> Method………………………………………</w:t>
-      </w:r>
-      <w:r>
-        <w:rPr>
-          <w:rFonts w:cs="Calibri"/>
-          <w:sz w:val="30"/>
-          <w:szCs w:val="30"/>
-        </w:rPr>
-        <w:t>.</w:t>
-      </w:r>
-      <w:r>
-        <w:rPr>
-          <w:rFonts w:cs="Calibri"/>
-          <w:sz w:val="30"/>
-          <w:szCs w:val="30"/>
-        </w:rPr>
-        <w:t>……….</w:t>
-      </w:r>
-      <w:r>
-        <w:rPr>
-          <w:rFonts w:cs="Calibri"/>
-          <w:sz w:val="30"/>
-          <w:szCs w:val="30"/>
-        </w:rPr>
-        <w:t>…………………….2</w:t>
+          <w:sz w:val="32"/>
+          <w:szCs w:val="32"/>
+        </w:rPr>
+        <w:t xml:space="preserve"> Method</w:t>
       </w:r>
     </w:p>
     <w:p>
@@ -145,71 +103,17 @@
           <w:rFonts w:cs="Calibri"/>
           <w:b/>
           <w:bCs/>
-          <w:sz w:val="30"/>
-          <w:szCs w:val="30"/>
-        </w:rPr>
-      </w:pPr>
-      <w:proofErr w:type="gramStart"/>
-      <w:r>
-        <w:rPr>
-          <w:rFonts w:cs="Calibri"/>
-          <w:b/>
-          <w:bCs/>
-          <w:sz w:val="30"/>
-          <w:szCs w:val="30"/>
-        </w:rPr>
-        <w:t>fold(</w:t>
-      </w:r>
-      <w:proofErr w:type="gramEnd"/>
-      <w:r>
-        <w:rPr>
-          <w:rFonts w:cs="Calibri"/>
-          <w:b/>
-          <w:bCs/>
-          <w:sz w:val="30"/>
-          <w:szCs w:val="30"/>
-        </w:rPr>
-        <w:t xml:space="preserve">) </w:t>
-      </w:r>
-      <w:r>
-        <w:rPr>
-          <w:rFonts w:cs="Calibri"/>
-          <w:sz w:val="30"/>
-          <w:szCs w:val="30"/>
-        </w:rPr>
-        <w:t>Method…………………………………………</w:t>
-      </w:r>
-      <w:r>
-        <w:rPr>
-          <w:rFonts w:cs="Calibri"/>
-          <w:sz w:val="30"/>
-          <w:szCs w:val="30"/>
-        </w:rPr>
-        <w:t>.</w:t>
-      </w:r>
-      <w:r>
-        <w:rPr>
-          <w:rFonts w:cs="Calibri"/>
-          <w:sz w:val="30"/>
-          <w:szCs w:val="30"/>
-        </w:rPr>
-        <w:t>………</w:t>
-      </w:r>
-      <w:r>
-        <w:rPr>
-          <w:rFonts w:cs="Calibri"/>
-          <w:sz w:val="30"/>
-          <w:szCs w:val="30"/>
-        </w:rPr>
-        <w:t>………….</w:t>
-      </w:r>
-      <w:r>
-        <w:rPr>
-          <w:rFonts w:cs="Calibri"/>
-          <w:sz w:val="30"/>
-          <w:szCs w:val="30"/>
-        </w:rPr>
-        <w:t>………..4</w:t>
+          <w:sz w:val="32"/>
+          <w:szCs w:val="32"/>
+        </w:rPr>
+      </w:pPr>
+      <w:r>
+        <w:rPr>
+          <w:rFonts w:cs="Calibri"/>
+          <w:sz w:val="32"/>
+          <w:szCs w:val="32"/>
+        </w:rPr>
+        <w:t>Method</w:t>
       </w:r>
     </w:p>
     <w:p>
@@ -221,8 +125,8 @@
         </w:numPr>
         <w:rPr>
           <w:rFonts w:cs="Calibri"/>
-          <w:sz w:val="30"/>
-          <w:szCs w:val="30"/>
+          <w:sz w:val="32"/>
+          <w:szCs w:val="32"/>
         </w:rPr>
       </w:pPr>
       <w:proofErr w:type="gramStart"/>
@@ -231,8 +135,8 @@
           <w:rFonts w:cs="Calibri"/>
           <w:b/>
           <w:bCs/>
-          <w:sz w:val="30"/>
-          <w:szCs w:val="30"/>
+          <w:sz w:val="32"/>
+          <w:szCs w:val="32"/>
         </w:rPr>
         <w:t>abs(</w:t>
       </w:r>
@@ -242,16 +146,16 @@
           <w:rFonts w:cs="Calibri"/>
           <w:b/>
           <w:bCs/>
-          <w:sz w:val="30"/>
-          <w:szCs w:val="30"/>
+          <w:sz w:val="32"/>
+          <w:szCs w:val="32"/>
         </w:rPr>
         <w:t>)</w:t>
       </w:r>
       <w:r>
         <w:rPr>
           <w:rFonts w:cs="Calibri"/>
-          <w:sz w:val="30"/>
-          <w:szCs w:val="30"/>
+          <w:sz w:val="32"/>
+          <w:szCs w:val="32"/>
         </w:rPr>
         <w:t xml:space="preserve"> and </w:t>
       </w:r>
@@ -260,50 +164,18 @@
           <w:rFonts w:cs="Calibri"/>
           <w:b/>
           <w:bCs/>
-          <w:sz w:val="30"/>
-          <w:szCs w:val="30"/>
+          <w:sz w:val="32"/>
+          <w:szCs w:val="32"/>
         </w:rPr>
         <w:t>clamp()</w:t>
       </w:r>
       <w:r>
         <w:rPr>
           <w:rFonts w:cs="Calibri"/>
-          <w:sz w:val="30"/>
-          <w:szCs w:val="30"/>
-        </w:rPr>
-        <w:t xml:space="preserve"> Methods…………………………………………</w:t>
-      </w:r>
-      <w:r>
-        <w:rPr>
-          <w:rFonts w:cs="Calibri"/>
-          <w:sz w:val="30"/>
-          <w:szCs w:val="30"/>
-        </w:rPr>
-        <w:t>..</w:t>
-      </w:r>
-      <w:r>
-        <w:rPr>
-          <w:rFonts w:cs="Calibri"/>
-          <w:sz w:val="30"/>
-          <w:szCs w:val="30"/>
-        </w:rPr>
-        <w:t>.........</w:t>
-      </w:r>
-      <w:r>
-        <w:rPr>
-          <w:rFonts w:cs="Calibri"/>
-          <w:sz w:val="30"/>
-          <w:szCs w:val="30"/>
-        </w:rPr>
-        <w:t>.</w:t>
-      </w:r>
-      <w:r>
-        <w:rPr>
-          <w:rFonts w:cs="Calibri"/>
-          <w:sz w:val="30"/>
-          <w:szCs w:val="30"/>
-        </w:rPr>
-        <w:t>5</w:t>
+          <w:sz w:val="32"/>
+          <w:szCs w:val="32"/>
+        </w:rPr>
+        <w:t xml:space="preserve"> Methods</w:t>
       </w:r>
     </w:p>
     <w:p>
@@ -315,8 +187,8 @@
         </w:numPr>
         <w:rPr>
           <w:rFonts w:cs="Calibri"/>
-          <w:sz w:val="30"/>
-          <w:szCs w:val="30"/>
+          <w:sz w:val="32"/>
+          <w:szCs w:val="32"/>
         </w:rPr>
       </w:pPr>
       <w:proofErr w:type="gramStart"/>
@@ -325,8 +197,8 @@
           <w:rFonts w:cs="Calibri"/>
           <w:b/>
           <w:bCs/>
-          <w:sz w:val="30"/>
-          <w:szCs w:val="30"/>
+          <w:sz w:val="32"/>
+          <w:szCs w:val="32"/>
         </w:rPr>
         <w:t>remainder(</w:t>
       </w:r>
@@ -336,50 +208,18 @@
           <w:rFonts w:cs="Calibri"/>
           <w:b/>
           <w:bCs/>
-          <w:sz w:val="30"/>
-          <w:szCs w:val="30"/>
+          <w:sz w:val="32"/>
+          <w:szCs w:val="32"/>
         </w:rPr>
         <w:t>)</w:t>
       </w:r>
       <w:r>
         <w:rPr>
           <w:rFonts w:cs="Calibri"/>
-          <w:sz w:val="30"/>
-          <w:szCs w:val="30"/>
-        </w:rPr>
-        <w:t xml:space="preserve"> Method……</w:t>
-      </w:r>
-      <w:r>
-        <w:rPr>
-          <w:rFonts w:cs="Calibri"/>
-          <w:sz w:val="30"/>
-          <w:szCs w:val="30"/>
-        </w:rPr>
-        <w:t>..</w:t>
-      </w:r>
-      <w:r>
-        <w:rPr>
-          <w:rFonts w:cs="Calibri"/>
-          <w:sz w:val="30"/>
-          <w:szCs w:val="30"/>
-        </w:rPr>
-        <w:t>……………………</w:t>
-      </w:r>
-      <w:r>
-        <w:rPr>
-          <w:rFonts w:cs="Calibri"/>
-          <w:sz w:val="30"/>
-          <w:szCs w:val="30"/>
-        </w:rPr>
-        <w:t>………….</w:t>
-      </w:r>
-      <w:r>
-        <w:rPr>
-          <w:rFonts w:cs="Calibri"/>
-          <w:sz w:val="30"/>
-          <w:szCs w:val="30"/>
-        </w:rPr>
-        <w:t>……………………..7</w:t>
+          <w:sz w:val="32"/>
+          <w:szCs w:val="32"/>
+        </w:rPr>
+        <w:t xml:space="preserve"> Method</w:t>
       </w:r>
     </w:p>
     <w:p>
@@ -391,8 +231,8 @@
         </w:numPr>
         <w:rPr>
           <w:rFonts w:cs="Calibri"/>
-          <w:sz w:val="30"/>
-          <w:szCs w:val="30"/>
+          <w:sz w:val="32"/>
+          <w:szCs w:val="32"/>
         </w:rPr>
       </w:pPr>
       <w:proofErr w:type="gramStart"/>
@@ -401,8 +241,8 @@
           <w:rFonts w:cs="Calibri"/>
           <w:b/>
           <w:bCs/>
-          <w:sz w:val="30"/>
-          <w:szCs w:val="30"/>
+          <w:sz w:val="32"/>
+          <w:szCs w:val="32"/>
         </w:rPr>
         <w:t>max(</w:t>
       </w:r>
@@ -412,58 +252,18 @@
           <w:rFonts w:cs="Calibri"/>
           <w:b/>
           <w:bCs/>
-          <w:sz w:val="30"/>
-          <w:szCs w:val="30"/>
+          <w:sz w:val="32"/>
+          <w:szCs w:val="32"/>
         </w:rPr>
         <w:t>)</w:t>
       </w:r>
       <w:r>
         <w:rPr>
           <w:rFonts w:cs="Calibri"/>
-          <w:sz w:val="30"/>
-          <w:szCs w:val="30"/>
-        </w:rPr>
-        <w:t xml:space="preserve"> Method…………………………..……</w:t>
-      </w:r>
-      <w:r>
-        <w:rPr>
-          <w:rFonts w:cs="Calibri"/>
-          <w:sz w:val="30"/>
-          <w:szCs w:val="30"/>
-        </w:rPr>
-        <w:t>….</w:t>
-      </w:r>
-      <w:r>
-        <w:rPr>
-          <w:rFonts w:cs="Calibri"/>
-          <w:sz w:val="30"/>
-          <w:szCs w:val="30"/>
-        </w:rPr>
-        <w:t>…………</w:t>
-      </w:r>
-      <w:r>
-        <w:rPr>
-          <w:rFonts w:cs="Calibri"/>
-          <w:sz w:val="30"/>
-          <w:szCs w:val="30"/>
-        </w:rPr>
-        <w:t>………….</w:t>
-      </w:r>
-      <w:r>
-        <w:rPr>
-          <w:rFonts w:cs="Calibri"/>
-          <w:sz w:val="30"/>
-          <w:szCs w:val="30"/>
-        </w:rPr>
-        <w:t>…………..</w:t>
-      </w:r>
-      <w:r>
-        <w:rPr>
-          <w:rFonts w:cs="Calibri"/>
-          <w:sz w:val="30"/>
-          <w:szCs w:val="30"/>
-        </w:rPr>
-        <w:t>8</w:t>
+          <w:sz w:val="32"/>
+          <w:szCs w:val="32"/>
+        </w:rPr>
+        <w:t xml:space="preserve"> Method</w:t>
       </w:r>
     </w:p>
     <w:p>
@@ -475,8 +275,8 @@
         </w:numPr>
         <w:rPr>
           <w:rFonts w:cs="Calibri"/>
-          <w:sz w:val="30"/>
-          <w:szCs w:val="30"/>
+          <w:sz w:val="32"/>
+          <w:szCs w:val="32"/>
         </w:rPr>
       </w:pPr>
       <w:proofErr w:type="gramStart"/>
@@ -485,8 +285,8 @@
           <w:rFonts w:cs="Calibri"/>
           <w:b/>
           <w:bCs/>
-          <w:sz w:val="30"/>
-          <w:szCs w:val="30"/>
+          <w:sz w:val="32"/>
+          <w:szCs w:val="32"/>
         </w:rPr>
         <w:t>lerp(</w:t>
       </w:r>
@@ -496,16 +296,16 @@
           <w:rFonts w:cs="Calibri"/>
           <w:b/>
           <w:bCs/>
-          <w:sz w:val="30"/>
-          <w:szCs w:val="30"/>
+          <w:sz w:val="32"/>
+          <w:szCs w:val="32"/>
         </w:rPr>
         <w:t>)</w:t>
       </w:r>
       <w:r>
         <w:rPr>
           <w:rFonts w:cs="Calibri"/>
-          <w:sz w:val="30"/>
-          <w:szCs w:val="30"/>
+          <w:sz w:val="32"/>
+          <w:szCs w:val="32"/>
         </w:rPr>
         <w:t xml:space="preserve"> &amp;</w:t>
       </w:r>
@@ -514,8 +314,8 @@
           <w:rFonts w:cs="Calibri"/>
           <w:b/>
           <w:bCs/>
-          <w:sz w:val="30"/>
-          <w:szCs w:val="30"/>
+          <w:sz w:val="32"/>
+          <w:szCs w:val="32"/>
         </w:rPr>
         <w:t xml:space="preserve"> </w:t>
       </w:r>
@@ -525,8 +325,8 @@
           <w:rFonts w:cs="Calibri"/>
           <w:b/>
           <w:bCs/>
-          <w:sz w:val="30"/>
-          <w:szCs w:val="30"/>
+          <w:sz w:val="32"/>
+          <w:szCs w:val="32"/>
         </w:rPr>
         <w:t>lerpDouble</w:t>
       </w:r>
@@ -536,42 +336,18 @@
           <w:rFonts w:cs="Calibri"/>
           <w:b/>
           <w:bCs/>
-          <w:sz w:val="30"/>
-          <w:szCs w:val="30"/>
+          <w:sz w:val="32"/>
+          <w:szCs w:val="32"/>
         </w:rPr>
         <w:t>()</w:t>
       </w:r>
       <w:r>
         <w:rPr>
           <w:rFonts w:cs="Calibri"/>
-          <w:sz w:val="30"/>
-          <w:szCs w:val="30"/>
-        </w:rPr>
-        <w:t xml:space="preserve"> Method……………………………………</w:t>
-      </w:r>
-      <w:r>
-        <w:rPr>
-          <w:rFonts w:cs="Calibri"/>
-          <w:sz w:val="30"/>
-          <w:szCs w:val="30"/>
-        </w:rPr>
-        <w:t>…..</w:t>
-      </w:r>
-      <w:r>
-        <w:rPr>
-          <w:rFonts w:cs="Calibri"/>
-          <w:sz w:val="30"/>
-          <w:szCs w:val="30"/>
-        </w:rPr>
-        <w:t>……..</w:t>
-      </w:r>
-      <w:r>
-        <w:rPr>
-          <w:rFonts w:cs="Calibri"/>
-          <w:sz w:val="30"/>
-          <w:szCs w:val="30"/>
-        </w:rPr>
-        <w:t>10</w:t>
+          <w:sz w:val="32"/>
+          <w:szCs w:val="32"/>
+        </w:rPr>
+        <w:t xml:space="preserve"> Method</w:t>
       </w:r>
     </w:p>
     <w:p>
@@ -583,8 +359,8 @@
         </w:numPr>
         <w:rPr>
           <w:rFonts w:cs="Calibri"/>
-          <w:sz w:val="30"/>
-          <w:szCs w:val="30"/>
+          <w:sz w:val="32"/>
+          <w:szCs w:val="32"/>
         </w:rPr>
       </w:pPr>
       <w:proofErr w:type="spellStart"/>
@@ -593,8 +369,8 @@
           <w:rFonts w:cs="Calibri"/>
           <w:b/>
           <w:bCs/>
-          <w:sz w:val="30"/>
-          <w:szCs w:val="30"/>
+          <w:sz w:val="32"/>
+          <w:szCs w:val="32"/>
         </w:rPr>
         <w:t>firstWhere</w:t>
       </w:r>
@@ -609,8 +385,8 @@
         </w:numPr>
         <w:rPr>
           <w:rFonts w:cs="Calibri"/>
-          <w:sz w:val="30"/>
-          <w:szCs w:val="30"/>
+          <w:sz w:val="32"/>
+          <w:szCs w:val="32"/>
         </w:rPr>
       </w:pPr>
       <w:proofErr w:type="spellStart"/>
@@ -619,8 +395,8 @@
           <w:rFonts w:cs="Calibri"/>
           <w:b/>
           <w:bCs/>
-          <w:sz w:val="30"/>
-          <w:szCs w:val="30"/>
+          <w:sz w:val="32"/>
+          <w:szCs w:val="32"/>
         </w:rPr>
         <w:t>padLeft</w:t>
       </w:r>
@@ -635,8 +411,8 @@
         </w:numPr>
         <w:rPr>
           <w:rFonts w:cs="Calibri"/>
-          <w:sz w:val="30"/>
-          <w:szCs w:val="30"/>
+          <w:sz w:val="32"/>
+          <w:szCs w:val="32"/>
         </w:rPr>
       </w:pPr>
       <w:proofErr w:type="spellStart"/>
@@ -645,8 +421,8 @@
           <w:rFonts w:cs="Calibri"/>
           <w:b/>
           <w:bCs/>
-          <w:sz w:val="30"/>
-          <w:szCs w:val="30"/>
+          <w:sz w:val="32"/>
+          <w:szCs w:val="32"/>
         </w:rPr>
         <w:t>List.filled</w:t>
       </w:r>
@@ -656,52 +432,18 @@
           <w:rFonts w:cs="Calibri"/>
           <w:b/>
           <w:bCs/>
-          <w:sz w:val="30"/>
-          <w:szCs w:val="30"/>
+          <w:sz w:val="32"/>
+          <w:szCs w:val="32"/>
         </w:rPr>
         <w:t>()</w:t>
       </w:r>
       <w:r>
         <w:rPr>
           <w:rFonts w:cs="Calibri"/>
-          <w:sz w:val="30"/>
-          <w:szCs w:val="30"/>
-        </w:rPr>
-        <w:t xml:space="preserve"> Method…………………………………………………</w:t>
-      </w:r>
-      <w:proofErr w:type="gramStart"/>
-      <w:r>
-        <w:rPr>
-          <w:rFonts w:cs="Calibri"/>
-          <w:sz w:val="30"/>
-          <w:szCs w:val="30"/>
-        </w:rPr>
-        <w:t>…</w:t>
-      </w:r>
-      <w:r>
-        <w:rPr>
-          <w:rFonts w:cs="Calibri"/>
-          <w:sz w:val="30"/>
-          <w:szCs w:val="30"/>
-        </w:rPr>
-        <w:t>..</w:t>
-      </w:r>
-      <w:proofErr w:type="gramEnd"/>
-      <w:r>
-        <w:rPr>
-          <w:rFonts w:cs="Calibri"/>
-          <w:sz w:val="30"/>
-          <w:szCs w:val="30"/>
-        </w:rPr>
-        <w:t>1</w:t>
-      </w:r>
-      <w:r>
-        <w:rPr>
-          <w:rFonts w:cs="Calibri"/>
-          <w:sz w:val="30"/>
-          <w:szCs w:val="30"/>
-        </w:rPr>
-        <w:t>1</w:t>
+          <w:sz w:val="32"/>
+          <w:szCs w:val="32"/>
+        </w:rPr>
+        <w:t xml:space="preserve"> Method</w:t>
       </w:r>
     </w:p>
     <w:p>
@@ -713,8 +455,8 @@
         </w:numPr>
         <w:rPr>
           <w:rFonts w:cs="Calibri"/>
-          <w:sz w:val="30"/>
-          <w:szCs w:val="30"/>
+          <w:sz w:val="32"/>
+          <w:szCs w:val="32"/>
         </w:rPr>
       </w:pPr>
       <w:proofErr w:type="spellStart"/>
@@ -723,8 +465,8 @@
           <w:rFonts w:cs="Calibri"/>
           <w:b/>
           <w:bCs/>
-          <w:sz w:val="30"/>
-          <w:szCs w:val="30"/>
+          <w:sz w:val="32"/>
+          <w:szCs w:val="32"/>
         </w:rPr>
         <w:t>List.from</w:t>
       </w:r>
@@ -734,52 +476,18 @@
           <w:rFonts w:cs="Calibri"/>
           <w:b/>
           <w:bCs/>
-          <w:sz w:val="30"/>
-          <w:szCs w:val="30"/>
+          <w:sz w:val="32"/>
+          <w:szCs w:val="32"/>
         </w:rPr>
         <w:t>()</w:t>
       </w:r>
       <w:r>
         <w:rPr>
           <w:rFonts w:cs="Calibri"/>
-          <w:sz w:val="30"/>
-          <w:szCs w:val="30"/>
-        </w:rPr>
-        <w:t xml:space="preserve"> Method……………………………………………</w:t>
-      </w:r>
-      <w:r>
-        <w:rPr>
-          <w:rFonts w:cs="Calibri"/>
-          <w:sz w:val="30"/>
-          <w:szCs w:val="30"/>
-        </w:rPr>
-        <w:t>…………</w:t>
-      </w:r>
-      <w:proofErr w:type="gramStart"/>
-      <w:r>
-        <w:rPr>
-          <w:rFonts w:cs="Calibri"/>
-          <w:sz w:val="30"/>
-          <w:szCs w:val="30"/>
-        </w:rPr>
-        <w:t>…..</w:t>
-      </w:r>
-      <w:proofErr w:type="gramEnd"/>
-      <w:r>
-        <w:rPr>
-          <w:rFonts w:cs="Calibri"/>
-          <w:sz w:val="30"/>
-          <w:szCs w:val="30"/>
-        </w:rPr>
-        <w:t>…1</w:t>
-      </w:r>
-      <w:r>
-        <w:rPr>
-          <w:rFonts w:cs="Calibri"/>
-          <w:sz w:val="30"/>
-          <w:szCs w:val="30"/>
-        </w:rPr>
-        <w:t>4</w:t>
+          <w:sz w:val="32"/>
+          <w:szCs w:val="32"/>
+        </w:rPr>
+        <w:t xml:space="preserve"> Method</w:t>
       </w:r>
     </w:p>
     <w:p>
@@ -791,8 +499,8 @@
         </w:numPr>
         <w:rPr>
           <w:rFonts w:cs="Calibri"/>
-          <w:sz w:val="30"/>
-          <w:szCs w:val="30"/>
+          <w:sz w:val="32"/>
+          <w:szCs w:val="32"/>
         </w:rPr>
       </w:pPr>
       <w:proofErr w:type="gramStart"/>
@@ -801,8 +509,8 @@
           <w:rFonts w:cs="Calibri"/>
           <w:b/>
           <w:bCs/>
-          <w:sz w:val="30"/>
-          <w:szCs w:val="30"/>
+          <w:sz w:val="32"/>
+          <w:szCs w:val="32"/>
         </w:rPr>
         <w:t>skip(</w:t>
       </w:r>
@@ -812,16 +520,16 @@
           <w:rFonts w:cs="Calibri"/>
           <w:b/>
           <w:bCs/>
-          <w:sz w:val="30"/>
-          <w:szCs w:val="30"/>
+          <w:sz w:val="32"/>
+          <w:szCs w:val="32"/>
         </w:rPr>
         <w:t>)</w:t>
       </w:r>
       <w:r>
         <w:rPr>
           <w:rFonts w:cs="Calibri"/>
-          <w:sz w:val="30"/>
-          <w:szCs w:val="30"/>
+          <w:sz w:val="32"/>
+          <w:szCs w:val="32"/>
         </w:rPr>
         <w:t xml:space="preserve"> and </w:t>
       </w:r>
@@ -830,66 +538,18 @@
           <w:rFonts w:cs="Calibri"/>
           <w:b/>
           <w:bCs/>
-          <w:sz w:val="30"/>
-          <w:szCs w:val="30"/>
+          <w:sz w:val="32"/>
+          <w:szCs w:val="32"/>
         </w:rPr>
         <w:t>take()</w:t>
       </w:r>
       <w:r>
         <w:rPr>
           <w:rFonts w:cs="Calibri"/>
-          <w:sz w:val="30"/>
-          <w:szCs w:val="30"/>
-        </w:rPr>
-        <w:t xml:space="preserve"> Method (List methods)………..…</w:t>
-      </w:r>
-      <w:r>
-        <w:rPr>
-          <w:rFonts w:cs="Calibri"/>
-          <w:sz w:val="30"/>
-          <w:szCs w:val="30"/>
-        </w:rPr>
-        <w:t>.</w:t>
-      </w:r>
-      <w:r>
-        <w:rPr>
-          <w:rFonts w:cs="Calibri"/>
-          <w:sz w:val="30"/>
-          <w:szCs w:val="30"/>
-        </w:rPr>
-        <w:t>…</w:t>
-      </w:r>
-      <w:r>
-        <w:rPr>
-          <w:rFonts w:cs="Calibri"/>
-          <w:sz w:val="30"/>
-          <w:szCs w:val="30"/>
-        </w:rPr>
-        <w:t>…………</w:t>
-      </w:r>
-      <w:r>
-        <w:rPr>
-          <w:rFonts w:cs="Calibri"/>
-          <w:sz w:val="30"/>
-          <w:szCs w:val="30"/>
-        </w:rPr>
-        <w:t>….</w:t>
-      </w:r>
-      <w:r>
-        <w:rPr>
-          <w:rFonts w:cs="Calibri"/>
-          <w:sz w:val="30"/>
-          <w:szCs w:val="30"/>
-        </w:rPr>
-        <w:t>.1</w:t>
-      </w:r>
-      <w:r>
-        <w:rPr>
-          <w:rFonts w:cs="Calibri"/>
-          <w:sz w:val="30"/>
-          <w:szCs w:val="30"/>
-        </w:rPr>
-        <w:t>5</w:t>
+          <w:sz w:val="32"/>
+          <w:szCs w:val="32"/>
+        </w:rPr>
+        <w:t xml:space="preserve"> Method (List methods)</w:t>
       </w:r>
     </w:p>
     <w:p>
@@ -901,8 +561,8 @@
         </w:numPr>
         <w:rPr>
           <w:rFonts w:cs="Calibri"/>
-          <w:sz w:val="30"/>
-          <w:szCs w:val="30"/>
+          <w:sz w:val="32"/>
+          <w:szCs w:val="32"/>
         </w:rPr>
       </w:pPr>
       <w:proofErr w:type="spellStart"/>
@@ -911,8 +571,8 @@
           <w:rFonts w:cs="Calibri"/>
           <w:b/>
           <w:bCs/>
-          <w:sz w:val="30"/>
-          <w:szCs w:val="30"/>
+          <w:sz w:val="32"/>
+          <w:szCs w:val="32"/>
         </w:rPr>
         <w:t>List.unmodifiable</w:t>
       </w:r>
@@ -922,68 +582,18 @@
           <w:rFonts w:cs="Calibri"/>
           <w:b/>
           <w:bCs/>
-          <w:sz w:val="30"/>
-          <w:szCs w:val="30"/>
+          <w:sz w:val="32"/>
+          <w:szCs w:val="32"/>
         </w:rPr>
         <w:t>()</w:t>
       </w:r>
       <w:r>
         <w:rPr>
           <w:rFonts w:cs="Calibri"/>
-          <w:sz w:val="30"/>
-          <w:szCs w:val="30"/>
-        </w:rPr>
-        <w:t xml:space="preserve"> Method………………………</w:t>
-      </w:r>
-      <w:r>
-        <w:rPr>
-          <w:rFonts w:cs="Calibri"/>
-          <w:sz w:val="30"/>
-          <w:szCs w:val="30"/>
-        </w:rPr>
-        <w:t>……</w:t>
-      </w:r>
-      <w:r>
-        <w:rPr>
-          <w:rFonts w:cs="Calibri"/>
-          <w:sz w:val="30"/>
-          <w:szCs w:val="30"/>
-        </w:rPr>
-        <w:t>…………</w:t>
-      </w:r>
-      <w:r>
-        <w:rPr>
-          <w:rFonts w:cs="Calibri"/>
-          <w:sz w:val="30"/>
-          <w:szCs w:val="30"/>
-        </w:rPr>
-        <w:t>…</w:t>
-      </w:r>
-      <w:proofErr w:type="gramStart"/>
-      <w:r>
-        <w:rPr>
-          <w:rFonts w:cs="Calibri"/>
-          <w:sz w:val="30"/>
-          <w:szCs w:val="30"/>
-        </w:rPr>
-        <w:t>…..</w:t>
-      </w:r>
-      <w:proofErr w:type="gramEnd"/>
-      <w:r>
-        <w:rPr>
-          <w:rFonts w:cs="Calibri"/>
-          <w:sz w:val="30"/>
-          <w:szCs w:val="30"/>
-        </w:rPr>
-        <w:t>1</w:t>
-      </w:r>
-      <w:r>
-        <w:rPr>
-          <w:rFonts w:cs="Calibri"/>
-          <w:sz w:val="30"/>
-          <w:szCs w:val="30"/>
-        </w:rPr>
-        <w:t>6</w:t>
+          <w:sz w:val="32"/>
+          <w:szCs w:val="32"/>
+        </w:rPr>
+        <w:t xml:space="preserve"> Method</w:t>
       </w:r>
     </w:p>
     <w:p>
@@ -995,8 +605,8 @@
         </w:numPr>
         <w:rPr>
           <w:rFonts w:cs="Calibri"/>
-          <w:sz w:val="30"/>
-          <w:szCs w:val="30"/>
+          <w:sz w:val="32"/>
+          <w:szCs w:val="32"/>
         </w:rPr>
       </w:pPr>
       <w:proofErr w:type="spellStart"/>
@@ -1006,8 +616,8 @@
           <w:rFonts w:cs="Calibri"/>
           <w:b/>
           <w:bCs/>
-          <w:sz w:val="30"/>
-          <w:szCs w:val="30"/>
+          <w:sz w:val="32"/>
+          <w:szCs w:val="32"/>
         </w:rPr>
         <w:t>putIfAbsent</w:t>
       </w:r>
@@ -1017,8 +627,8 @@
           <w:rFonts w:cs="Calibri"/>
           <w:b/>
           <w:bCs/>
-          <w:sz w:val="30"/>
-          <w:szCs w:val="30"/>
+          <w:sz w:val="32"/>
+          <w:szCs w:val="32"/>
         </w:rPr>
         <w:t>(</w:t>
       </w:r>
@@ -1028,58 +638,18 @@
           <w:rFonts w:cs="Calibri"/>
           <w:b/>
           <w:bCs/>
-          <w:sz w:val="30"/>
-          <w:szCs w:val="30"/>
+          <w:sz w:val="32"/>
+          <w:szCs w:val="32"/>
         </w:rPr>
         <w:t>)</w:t>
       </w:r>
       <w:r>
         <w:rPr>
           <w:rFonts w:cs="Calibri"/>
-          <w:sz w:val="30"/>
-          <w:szCs w:val="30"/>
-        </w:rPr>
-        <w:t xml:space="preserve"> (Map Method)………………………</w:t>
-      </w:r>
-      <w:r>
-        <w:rPr>
-          <w:rFonts w:cs="Calibri"/>
-          <w:sz w:val="30"/>
-          <w:szCs w:val="30"/>
-        </w:rPr>
-        <w:t>…..</w:t>
-      </w:r>
-      <w:r>
-        <w:rPr>
-          <w:rFonts w:cs="Calibri"/>
-          <w:sz w:val="30"/>
-          <w:szCs w:val="30"/>
-        </w:rPr>
-        <w:t>……..</w:t>
-      </w:r>
-      <w:r>
-        <w:rPr>
-          <w:rFonts w:cs="Calibri"/>
-          <w:sz w:val="30"/>
-          <w:szCs w:val="30"/>
-        </w:rPr>
-        <w:t>............</w:t>
-      </w:r>
-      <w:r>
-        <w:rPr>
-          <w:rFonts w:cs="Calibri"/>
-          <w:sz w:val="30"/>
-          <w:szCs w:val="30"/>
-        </w:rPr>
-        <w:t>1</w:t>
-      </w:r>
-      <w:r>
-        <w:rPr>
-          <w:rFonts w:cs="Calibri"/>
-          <w:sz w:val="30"/>
-          <w:szCs w:val="30"/>
-        </w:rPr>
-        <w:t>6</w:t>
+          <w:sz w:val="32"/>
+          <w:szCs w:val="32"/>
+        </w:rPr>
+        <w:t xml:space="preserve"> (Map Method)</w:t>
       </w:r>
     </w:p>
     <w:p>
@@ -1091,41 +661,17 @@
         </w:numPr>
         <w:rPr>
           <w:rFonts w:cs="Calibri"/>
-          <w:sz w:val="30"/>
-          <w:szCs w:val="30"/>
-        </w:rPr>
-      </w:pPr>
-      <w:r>
-        <w:rPr>
-          <w:rFonts w:cs="Calibri"/>
-          <w:sz w:val="30"/>
-          <w:szCs w:val="30"/>
-        </w:rPr>
-        <w:t>Spread Operator with List…………………………………</w:t>
-      </w:r>
-      <w:r>
-        <w:rPr>
-          <w:rFonts w:cs="Calibri"/>
-          <w:sz w:val="30"/>
-          <w:szCs w:val="30"/>
-        </w:rPr>
-        <w:t>……</w:t>
-      </w:r>
-      <w:r>
-        <w:rPr>
-          <w:rFonts w:cs="Calibri"/>
-          <w:sz w:val="30"/>
-          <w:szCs w:val="30"/>
-        </w:rPr>
-        <w:t>............</w:t>
-      </w:r>
-      <w:r>
-        <w:rPr>
-          <w:rFonts w:cs="Calibri"/>
-          <w:sz w:val="30"/>
-          <w:szCs w:val="30"/>
-        </w:rPr>
-        <w:t>19</w:t>
+          <w:sz w:val="32"/>
+          <w:szCs w:val="32"/>
+        </w:rPr>
+      </w:pPr>
+      <w:r>
+        <w:rPr>
+          <w:rFonts w:cs="Calibri"/>
+          <w:sz w:val="32"/>
+          <w:szCs w:val="32"/>
+        </w:rPr>
+        <w:t>Spread Operator with List</w:t>
       </w:r>
     </w:p>
     <w:p>
@@ -1137,57 +683,17 @@
         </w:numPr>
         <w:rPr>
           <w:rFonts w:cs="Calibri"/>
-          <w:sz w:val="30"/>
-          <w:szCs w:val="30"/>
-        </w:rPr>
-      </w:pPr>
-      <w:r>
-        <w:rPr>
-          <w:rFonts w:cs="Calibri"/>
-          <w:sz w:val="30"/>
-          <w:szCs w:val="30"/>
-        </w:rPr>
-        <w:t>Spread Operator with if-else…………………………………</w:t>
-      </w:r>
-      <w:r>
-        <w:rPr>
-          <w:rFonts w:cs="Calibri"/>
-          <w:sz w:val="30"/>
-          <w:szCs w:val="30"/>
-        </w:rPr>
-        <w:t>…</w:t>
-      </w:r>
-      <w:r>
-        <w:rPr>
-          <w:rFonts w:cs="Calibri"/>
-          <w:sz w:val="30"/>
-          <w:szCs w:val="30"/>
-        </w:rPr>
-        <w:t>.</w:t>
-      </w:r>
-      <w:r>
-        <w:rPr>
-          <w:rFonts w:cs="Calibri"/>
-          <w:sz w:val="30"/>
-          <w:szCs w:val="30"/>
-        </w:rPr>
-        <w:t>……….</w:t>
-      </w:r>
-      <w:r>
-        <w:rPr>
-          <w:rFonts w:cs="Calibri"/>
-          <w:sz w:val="30"/>
-          <w:szCs w:val="30"/>
-        </w:rPr>
-        <w:t>2</w:t>
-      </w:r>
-      <w:r>
-        <w:rPr>
-          <w:rFonts w:cs="Calibri"/>
-          <w:sz w:val="30"/>
-          <w:szCs w:val="30"/>
-        </w:rPr>
-        <w:t>1</w:t>
+          <w:sz w:val="32"/>
+          <w:szCs w:val="32"/>
+        </w:rPr>
+      </w:pPr>
+      <w:r>
+        <w:rPr>
+          <w:rFonts w:cs="Calibri"/>
+          <w:sz w:val="32"/>
+          <w:szCs w:val="32"/>
+        </w:rPr>
+        <w:t>Spread Operator with if-else</w:t>
       </w:r>
     </w:p>
     <w:p>
@@ -1199,57 +705,17 @@
         </w:numPr>
         <w:rPr>
           <w:rFonts w:cs="Calibri"/>
-          <w:sz w:val="30"/>
-          <w:szCs w:val="30"/>
-        </w:rPr>
-      </w:pPr>
-      <w:r>
-        <w:rPr>
-          <w:rFonts w:cs="Calibri"/>
-          <w:sz w:val="30"/>
-          <w:szCs w:val="30"/>
-        </w:rPr>
-        <w:t>Traditional For loop in Column/Row………………………</w:t>
-      </w:r>
-      <w:r>
-        <w:rPr>
-          <w:rFonts w:cs="Calibri"/>
-          <w:sz w:val="30"/>
-          <w:szCs w:val="30"/>
-        </w:rPr>
-        <w:t>……</w:t>
-      </w:r>
-      <w:r>
-        <w:rPr>
-          <w:rFonts w:cs="Calibri"/>
-          <w:sz w:val="30"/>
-          <w:szCs w:val="30"/>
-        </w:rPr>
-        <w:t>…</w:t>
-      </w:r>
-      <w:r>
-        <w:rPr>
-          <w:rFonts w:cs="Calibri"/>
-          <w:sz w:val="30"/>
-          <w:szCs w:val="30"/>
-        </w:rPr>
-        <w:t>……</w:t>
-      </w:r>
-      <w:r>
-        <w:rPr>
-          <w:rFonts w:cs="Calibri"/>
-          <w:sz w:val="30"/>
-          <w:szCs w:val="30"/>
-        </w:rPr>
-        <w:t>2</w:t>
-      </w:r>
-      <w:r>
-        <w:rPr>
-          <w:rFonts w:cs="Calibri"/>
-          <w:sz w:val="30"/>
-          <w:szCs w:val="30"/>
-        </w:rPr>
-        <w:t>2</w:t>
+          <w:sz w:val="32"/>
+          <w:szCs w:val="32"/>
+        </w:rPr>
+      </w:pPr>
+      <w:r>
+        <w:rPr>
+          <w:rFonts w:cs="Calibri"/>
+          <w:sz w:val="32"/>
+          <w:szCs w:val="32"/>
+        </w:rPr>
+        <w:t>Traditional For loop in Column/Row</w:t>
       </w:r>
     </w:p>
     <w:p>
@@ -1261,67 +727,19 @@
         </w:numPr>
         <w:rPr>
           <w:rFonts w:cs="Calibri"/>
-          <w:sz w:val="30"/>
-          <w:szCs w:val="30"/>
-        </w:rPr>
-      </w:pPr>
-      <w:r>
-        <w:rPr>
-          <w:rFonts w:cs="Calibri"/>
-          <w:b/>
-          <w:bCs/>
-          <w:sz w:val="30"/>
-          <w:szCs w:val="30"/>
+          <w:sz w:val="32"/>
+          <w:szCs w:val="32"/>
+        </w:rPr>
+      </w:pPr>
+      <w:r>
+        <w:rPr>
+          <w:rFonts w:cs="Calibri"/>
+          <w:b/>
+          <w:bCs/>
+          <w:sz w:val="32"/>
+          <w:szCs w:val="32"/>
         </w:rPr>
         <w:t>enum</w:t>
-      </w:r>
-      <w:r>
-        <w:rPr>
-          <w:rFonts w:cs="Calibri"/>
-          <w:sz w:val="30"/>
-          <w:szCs w:val="30"/>
-        </w:rPr>
-        <w:t>………………………</w:t>
-      </w:r>
-      <w:r>
-        <w:rPr>
-          <w:rFonts w:cs="Calibri"/>
-          <w:sz w:val="30"/>
-          <w:szCs w:val="30"/>
-        </w:rPr>
-        <w:t>………………………………………</w:t>
-      </w:r>
-      <w:r>
-        <w:rPr>
-          <w:rFonts w:cs="Calibri"/>
-          <w:sz w:val="30"/>
-          <w:szCs w:val="30"/>
-        </w:rPr>
-        <w:t>………</w:t>
-      </w:r>
-      <w:r>
-        <w:rPr>
-          <w:rFonts w:cs="Calibri"/>
-          <w:sz w:val="30"/>
-          <w:szCs w:val="30"/>
-        </w:rPr>
-        <w:t>…….</w:t>
-      </w:r>
-      <w:r>
-        <w:rPr>
-          <w:rFonts w:cs="Calibri"/>
-          <w:sz w:val="30"/>
-          <w:szCs w:val="30"/>
-        </w:rPr>
-        <w:t>2</w:t>
-      </w:r>
-      <w:r>
-        <w:rPr>
-          <w:rFonts w:cs="Calibri"/>
-          <w:sz w:val="30"/>
-          <w:szCs w:val="30"/>
-        </w:rPr>
-        <w:t>2</w:t>
       </w:r>
     </w:p>
     <w:p>
@@ -1333,15 +751,15 @@
         </w:numPr>
         <w:rPr>
           <w:rFonts w:cs="Calibri"/>
-          <w:sz w:val="30"/>
-          <w:szCs w:val="30"/>
-        </w:rPr>
-      </w:pPr>
-      <w:r>
-        <w:rPr>
-          <w:rFonts w:cs="Calibri"/>
-          <w:sz w:val="30"/>
-          <w:szCs w:val="30"/>
+          <w:sz w:val="32"/>
+          <w:szCs w:val="32"/>
+        </w:rPr>
+      </w:pPr>
+      <w:r>
+        <w:rPr>
+          <w:rFonts w:cs="Calibri"/>
+          <w:sz w:val="32"/>
+          <w:szCs w:val="32"/>
         </w:rPr>
         <w:t xml:space="preserve">Dot Short-Hands for </w:t>
       </w:r>
@@ -1350,58 +768,10 @@
           <w:rFonts w:cs="Calibri"/>
           <w:b/>
           <w:bCs/>
-          <w:sz w:val="30"/>
-          <w:szCs w:val="30"/>
+          <w:sz w:val="32"/>
+          <w:szCs w:val="32"/>
         </w:rPr>
         <w:t>enum</w:t>
-      </w:r>
-      <w:r>
-        <w:rPr>
-          <w:rFonts w:cs="Calibri"/>
-          <w:sz w:val="30"/>
-          <w:szCs w:val="30"/>
-        </w:rPr>
-        <w:t>……………………</w:t>
-      </w:r>
-      <w:r>
-        <w:rPr>
-          <w:rFonts w:cs="Calibri"/>
-          <w:sz w:val="30"/>
-          <w:szCs w:val="30"/>
-        </w:rPr>
-        <w:t>…</w:t>
-      </w:r>
-      <w:r>
-        <w:rPr>
-          <w:rFonts w:cs="Calibri"/>
-          <w:sz w:val="30"/>
-          <w:szCs w:val="30"/>
-        </w:rPr>
-        <w:t>……………</w:t>
-      </w:r>
-      <w:r>
-        <w:rPr>
-          <w:rFonts w:cs="Calibri"/>
-          <w:sz w:val="30"/>
-          <w:szCs w:val="30"/>
-        </w:rPr>
-        <w:t>………….</w:t>
-      </w:r>
-      <w:r>
-        <w:rPr>
-          <w:rFonts w:cs="Calibri"/>
-          <w:sz w:val="30"/>
-          <w:szCs w:val="30"/>
-        </w:rPr>
-        <w:t>2</w:t>
-      </w:r>
-      <w:r>
-        <w:rPr>
-          <w:rFonts w:cs="Calibri"/>
-          <w:sz w:val="30"/>
-          <w:szCs w:val="30"/>
-        </w:rPr>
-        <w:t>5</w:t>
       </w:r>
     </w:p>
     <w:p>
@@ -1413,17 +783,17 @@
         </w:numPr>
         <w:rPr>
           <w:rFonts w:cs="Calibri"/>
-          <w:sz w:val="30"/>
-          <w:szCs w:val="30"/>
-        </w:rPr>
-      </w:pPr>
-      <w:r>
-        <w:rPr>
-          <w:rFonts w:cs="Calibri"/>
-          <w:b/>
-          <w:bCs/>
-          <w:sz w:val="30"/>
-          <w:szCs w:val="30"/>
+          <w:sz w:val="32"/>
+          <w:szCs w:val="32"/>
+        </w:rPr>
+      </w:pPr>
+      <w:r>
+        <w:rPr>
+          <w:rFonts w:cs="Calibri"/>
+          <w:b/>
+          <w:bCs/>
+          <w:sz w:val="32"/>
+          <w:szCs w:val="32"/>
         </w:rPr>
         <w:t xml:space="preserve">throw </w:t>
       </w:r>
@@ -1433,8 +803,8 @@
           <w:rFonts w:cs="Calibri"/>
           <w:b/>
           <w:bCs/>
-          <w:sz w:val="30"/>
-          <w:szCs w:val="30"/>
+          <w:sz w:val="32"/>
+          <w:szCs w:val="32"/>
         </w:rPr>
         <w:t>Exception(</w:t>
       </w:r>
@@ -1444,58 +814,10 @@
           <w:rFonts w:cs="Calibri"/>
           <w:b/>
           <w:bCs/>
-          <w:sz w:val="30"/>
-          <w:szCs w:val="30"/>
+          <w:sz w:val="32"/>
+          <w:szCs w:val="32"/>
         </w:rPr>
         <w:t>)</w:t>
-      </w:r>
-      <w:r>
-        <w:rPr>
-          <w:rFonts w:cs="Calibri"/>
-          <w:sz w:val="30"/>
-          <w:szCs w:val="30"/>
-        </w:rPr>
-        <w:t>.………………..………</w:t>
-      </w:r>
-      <w:r>
-        <w:rPr>
-          <w:rFonts w:cs="Calibri"/>
-          <w:sz w:val="30"/>
-          <w:szCs w:val="30"/>
-        </w:rPr>
-        <w:t>…………………..</w:t>
-      </w:r>
-      <w:r>
-        <w:rPr>
-          <w:rFonts w:cs="Calibri"/>
-          <w:sz w:val="30"/>
-          <w:szCs w:val="30"/>
-        </w:rPr>
-        <w:t>…</w:t>
-      </w:r>
-      <w:r>
-        <w:rPr>
-          <w:rFonts w:cs="Calibri"/>
-          <w:sz w:val="30"/>
-          <w:szCs w:val="30"/>
-        </w:rPr>
-        <w:t>…………</w:t>
-      </w:r>
-      <w:r>
-        <w:rPr>
-          <w:rFonts w:cs="Calibri"/>
-          <w:sz w:val="30"/>
-          <w:szCs w:val="30"/>
-        </w:rPr>
-        <w:t>2</w:t>
-      </w:r>
-      <w:r>
-        <w:rPr>
-          <w:rFonts w:cs="Calibri"/>
-          <w:sz w:val="30"/>
-          <w:szCs w:val="30"/>
-        </w:rPr>
-        <w:t>6</w:t>
       </w:r>
     </w:p>
     <w:p>
@@ -1507,15 +829,15 @@
         </w:numPr>
         <w:rPr>
           <w:rFonts w:cs="Calibri"/>
-          <w:sz w:val="30"/>
-          <w:szCs w:val="30"/>
-        </w:rPr>
-      </w:pPr>
-      <w:r>
-        <w:rPr>
-          <w:rFonts w:cs="Calibri"/>
-          <w:sz w:val="30"/>
-          <w:szCs w:val="30"/>
+          <w:sz w:val="32"/>
+          <w:szCs w:val="32"/>
+        </w:rPr>
+      </w:pPr>
+      <w:r>
+        <w:rPr>
+          <w:rFonts w:cs="Calibri"/>
+          <w:sz w:val="32"/>
+          <w:szCs w:val="32"/>
         </w:rPr>
         <w:t>Map unpacking (</w:t>
       </w:r>
@@ -1524,70 +846,18 @@
           <w:rFonts w:cs="Calibri"/>
           <w:b/>
           <w:bCs/>
-          <w:sz w:val="30"/>
-          <w:szCs w:val="30"/>
-        </w:rPr>
-        <w:t>List&lt;Map</w:t>
-      </w:r>
-      <w:proofErr w:type="gramStart"/>
-      <w:r>
-        <w:rPr>
-          <w:rFonts w:cs="Calibri"/>
-          <w:b/>
-          <w:bCs/>
-          <w:sz w:val="30"/>
-          <w:szCs w:val="30"/>
-        </w:rPr>
-        <w:t>&gt;</w:t>
-      </w:r>
-      <w:r>
-        <w:rPr>
-          <w:rFonts w:cs="Calibri"/>
-          <w:sz w:val="30"/>
-          <w:szCs w:val="30"/>
-        </w:rPr>
-        <w:t>)…</w:t>
-      </w:r>
-      <w:proofErr w:type="gramEnd"/>
-      <w:r>
-        <w:rPr>
-          <w:rFonts w:cs="Calibri"/>
-          <w:sz w:val="30"/>
-          <w:szCs w:val="30"/>
-        </w:rPr>
-        <w:t>……………………………</w:t>
-      </w:r>
-      <w:r>
-        <w:rPr>
-          <w:rFonts w:cs="Calibri"/>
-          <w:sz w:val="30"/>
-          <w:szCs w:val="30"/>
-        </w:rPr>
-        <w:t>…….</w:t>
-      </w:r>
-      <w:r>
-        <w:rPr>
-          <w:rFonts w:cs="Calibri"/>
-          <w:sz w:val="30"/>
-          <w:szCs w:val="30"/>
-        </w:rPr>
-        <w:t>……….</w:t>
-      </w:r>
-      <w:r>
-        <w:rPr>
-          <w:rFonts w:cs="Calibri"/>
-          <w:sz w:val="30"/>
-          <w:szCs w:val="30"/>
-        </w:rPr>
-        <w:t>2</w:t>
-      </w:r>
-      <w:r>
-        <w:rPr>
-          <w:rFonts w:cs="Calibri"/>
-          <w:sz w:val="30"/>
-          <w:szCs w:val="30"/>
-        </w:rPr>
-        <w:t>7</w:t>
+          <w:sz w:val="32"/>
+          <w:szCs w:val="32"/>
+        </w:rPr>
+        <w:t>List&lt;Map&gt;</w:t>
+      </w:r>
+      <w:r>
+        <w:rPr>
+          <w:rFonts w:cs="Calibri"/>
+          <w:sz w:val="32"/>
+          <w:szCs w:val="32"/>
+        </w:rPr>
+        <w:t>)</w:t>
       </w:r>
     </w:p>
     <w:p>
@@ -1599,69 +869,19 @@
         </w:numPr>
         <w:rPr>
           <w:rFonts w:cs="Calibri"/>
-          <w:sz w:val="30"/>
-          <w:szCs w:val="30"/>
-        </w:rPr>
-      </w:pPr>
-      <w:r>
-        <w:rPr>
-          <w:rFonts w:cs="Calibri"/>
-          <w:b/>
-          <w:bCs/>
-          <w:sz w:val="30"/>
-          <w:szCs w:val="30"/>
+          <w:sz w:val="32"/>
+          <w:szCs w:val="32"/>
+        </w:rPr>
+      </w:pPr>
+      <w:r>
+        <w:rPr>
+          <w:rFonts w:cs="Calibri"/>
+          <w:b/>
+          <w:bCs/>
+          <w:sz w:val="32"/>
+          <w:szCs w:val="32"/>
         </w:rPr>
         <w:t>Duration</w:t>
-      </w:r>
-      <w:r>
-        <w:rPr>
-          <w:rFonts w:cs="Calibri"/>
-          <w:sz w:val="30"/>
-          <w:szCs w:val="30"/>
-        </w:rPr>
-        <w:t>…………………………………</w:t>
-      </w:r>
-      <w:r>
-        <w:rPr>
-          <w:rFonts w:cs="Calibri"/>
-          <w:sz w:val="30"/>
-          <w:szCs w:val="30"/>
-        </w:rPr>
-        <w:t>……</w:t>
-      </w:r>
-      <w:r>
-        <w:rPr>
-          <w:rFonts w:cs="Calibri"/>
-          <w:sz w:val="30"/>
-          <w:szCs w:val="30"/>
-        </w:rPr>
-        <w:t>……………………</w:t>
-      </w:r>
-      <w:r>
-        <w:rPr>
-          <w:rFonts w:cs="Calibri"/>
-          <w:sz w:val="30"/>
-          <w:szCs w:val="30"/>
-        </w:rPr>
-        <w:t>………</w:t>
-      </w:r>
-      <w:proofErr w:type="gramStart"/>
-      <w:r>
-        <w:rPr>
-          <w:rFonts w:cs="Calibri"/>
-          <w:sz w:val="30"/>
-          <w:szCs w:val="30"/>
-        </w:rPr>
-        <w:t>…..</w:t>
-      </w:r>
-      <w:proofErr w:type="gramEnd"/>
-      <w:r>
-        <w:rPr>
-          <w:rFonts w:cs="Calibri"/>
-          <w:sz w:val="30"/>
-          <w:szCs w:val="30"/>
-        </w:rPr>
-        <w:t>28</w:t>
       </w:r>
     </w:p>
     <w:p>
@@ -1675,8 +895,8 @@
           <w:rFonts w:cs="Calibri"/>
           <w:b/>
           <w:bCs/>
-          <w:sz w:val="30"/>
-          <w:szCs w:val="30"/>
+          <w:sz w:val="32"/>
+          <w:szCs w:val="32"/>
         </w:rPr>
       </w:pPr>
       <w:proofErr w:type="spellStart"/>
@@ -1685,8 +905,8 @@
           <w:rFonts w:cs="Calibri"/>
           <w:b/>
           <w:bCs/>
-          <w:sz w:val="30"/>
-          <w:szCs w:val="30"/>
+          <w:sz w:val="32"/>
+          <w:szCs w:val="32"/>
         </w:rPr>
         <w:t>DateTime</w:t>
       </w:r>
@@ -1694,50 +914,10 @@
       <w:r>
         <w:rPr>
           <w:rFonts w:cs="Calibri"/>
-          <w:sz w:val="30"/>
-          <w:szCs w:val="30"/>
-        </w:rPr>
-        <w:t xml:space="preserve"> Class……………………………………………</w:t>
-      </w:r>
-      <w:r>
-        <w:rPr>
-          <w:rFonts w:cs="Calibri"/>
-          <w:sz w:val="30"/>
-          <w:szCs w:val="30"/>
-        </w:rPr>
-        <w:t>…</w:t>
-      </w:r>
-      <w:r>
-        <w:rPr>
-          <w:rFonts w:cs="Calibri"/>
-          <w:sz w:val="30"/>
-          <w:szCs w:val="30"/>
-        </w:rPr>
-        <w:t>…</w:t>
-      </w:r>
-      <w:r>
-        <w:rPr>
-          <w:rFonts w:cs="Calibri"/>
-          <w:sz w:val="30"/>
-          <w:szCs w:val="30"/>
-        </w:rPr>
-        <w:t>……………</w:t>
-      </w:r>
-      <w:r>
-        <w:rPr>
-          <w:rFonts w:cs="Calibri"/>
-          <w:sz w:val="30"/>
-          <w:szCs w:val="30"/>
-        </w:rPr>
-        <w:t>3</w:t>
-      </w:r>
-      <w:r>
-        <w:rPr>
-          <w:rFonts w:cs="Calibri"/>
-          <w:sz w:val="30"/>
-          <w:szCs w:val="30"/>
-        </w:rPr>
-        <w:t>2</w:t>
+          <w:sz w:val="32"/>
+          <w:szCs w:val="32"/>
+        </w:rPr>
+        <w:t xml:space="preserve"> Class</w:t>
       </w:r>
     </w:p>
     <w:p>
@@ -1751,15 +931,15 @@
           <w:rFonts w:cs="Calibri"/>
           <w:b/>
           <w:bCs/>
-          <w:sz w:val="30"/>
-          <w:szCs w:val="30"/>
-        </w:rPr>
-      </w:pPr>
-      <w:r>
-        <w:rPr>
-          <w:rFonts w:cs="Calibri"/>
-          <w:sz w:val="30"/>
-          <w:szCs w:val="30"/>
+          <w:sz w:val="32"/>
+          <w:szCs w:val="32"/>
+        </w:rPr>
+      </w:pPr>
+      <w:r>
+        <w:rPr>
+          <w:rFonts w:cs="Calibri"/>
+          <w:sz w:val="32"/>
+          <w:szCs w:val="32"/>
         </w:rPr>
         <w:t xml:space="preserve">Debounce/Timer in </w:t>
       </w:r>
@@ -1768,50 +948,10 @@
           <w:rFonts w:cs="Calibri"/>
           <w:b/>
           <w:bCs/>
-          <w:sz w:val="30"/>
-          <w:szCs w:val="30"/>
+          <w:sz w:val="32"/>
+          <w:szCs w:val="32"/>
         </w:rPr>
         <w:t>Dart</w:t>
-      </w:r>
-      <w:r>
-        <w:rPr>
-          <w:rFonts w:cs="Calibri"/>
-          <w:sz w:val="30"/>
-          <w:szCs w:val="30"/>
-        </w:rPr>
-        <w:t>…………………………….…………</w:t>
-      </w:r>
-      <w:r>
-        <w:rPr>
-          <w:rFonts w:cs="Calibri"/>
-          <w:sz w:val="30"/>
-          <w:szCs w:val="30"/>
-        </w:rPr>
-        <w:t>…</w:t>
-      </w:r>
-      <w:r>
-        <w:rPr>
-          <w:rFonts w:cs="Calibri"/>
-          <w:sz w:val="30"/>
-          <w:szCs w:val="30"/>
-        </w:rPr>
-        <w:t>……….</w:t>
-      </w:r>
-      <w:r>
-        <w:rPr>
-          <w:rFonts w:cs="Calibri"/>
-          <w:sz w:val="30"/>
-          <w:szCs w:val="30"/>
-        </w:rPr>
-        <w:t>3</w:t>
-      </w:r>
-      <w:r>
-        <w:rPr>
-          <w:rFonts w:cs="Calibri"/>
-          <w:sz w:val="30"/>
-          <w:szCs w:val="30"/>
-        </w:rPr>
-        <w:t>4</w:t>
       </w:r>
     </w:p>
     <w:p>
@@ -1825,25 +965,25 @@
           <w:rFonts w:cs="Calibri"/>
           <w:b/>
           <w:bCs/>
-          <w:sz w:val="30"/>
-          <w:szCs w:val="30"/>
-        </w:rPr>
-      </w:pPr>
-      <w:r>
-        <w:rPr>
-          <w:rFonts w:cs="Calibri"/>
-          <w:b/>
-          <w:bCs/>
-          <w:sz w:val="30"/>
-          <w:szCs w:val="30"/>
+          <w:sz w:val="32"/>
+          <w:szCs w:val="32"/>
+        </w:rPr>
+      </w:pPr>
+      <w:r>
+        <w:rPr>
+          <w:rFonts w:cs="Calibri"/>
+          <w:b/>
+          <w:bCs/>
+          <w:sz w:val="32"/>
+          <w:szCs w:val="32"/>
         </w:rPr>
         <w:t>extension</w:t>
       </w:r>
       <w:r>
         <w:rPr>
           <w:rFonts w:cs="Calibri"/>
-          <w:sz w:val="30"/>
-          <w:szCs w:val="30"/>
+          <w:sz w:val="32"/>
+          <w:szCs w:val="32"/>
         </w:rPr>
         <w:t xml:space="preserve"> in </w:t>
       </w:r>
@@ -1852,50 +992,10 @@
           <w:rFonts w:cs="Calibri"/>
           <w:b/>
           <w:bCs/>
-          <w:sz w:val="30"/>
-          <w:szCs w:val="30"/>
+          <w:sz w:val="32"/>
+          <w:szCs w:val="32"/>
         </w:rPr>
         <w:t>Dart</w:t>
-      </w:r>
-      <w:r>
-        <w:rPr>
-          <w:rFonts w:cs="Calibri"/>
-          <w:sz w:val="30"/>
-          <w:szCs w:val="30"/>
-        </w:rPr>
-        <w:t>………………………………………</w:t>
-      </w:r>
-      <w:r>
-        <w:rPr>
-          <w:rFonts w:cs="Calibri"/>
-          <w:sz w:val="30"/>
-          <w:szCs w:val="30"/>
-        </w:rPr>
-        <w:t>……</w:t>
-      </w:r>
-      <w:r>
-        <w:rPr>
-          <w:rFonts w:cs="Calibri"/>
-          <w:sz w:val="30"/>
-          <w:szCs w:val="30"/>
-        </w:rPr>
-        <w:t>…</w:t>
-      </w:r>
-      <w:r>
-        <w:rPr>
-          <w:rFonts w:cs="Calibri"/>
-          <w:sz w:val="30"/>
-          <w:szCs w:val="30"/>
-        </w:rPr>
-        <w:t>……………3</w:t>
-      </w:r>
-      <w:r>
-        <w:rPr>
-          <w:rFonts w:cs="Calibri"/>
-          <w:sz w:val="30"/>
-          <w:szCs w:val="30"/>
-        </w:rPr>
-        <w:t>5</w:t>
       </w:r>
     </w:p>
     <w:p>
@@ -1909,25 +1009,25 @@
           <w:rFonts w:cs="Calibri"/>
           <w:b/>
           <w:bCs/>
-          <w:sz w:val="30"/>
-          <w:szCs w:val="30"/>
-        </w:rPr>
-      </w:pPr>
-      <w:r>
-        <w:rPr>
-          <w:rFonts w:cs="Calibri"/>
-          <w:b/>
-          <w:bCs/>
-          <w:sz w:val="30"/>
-          <w:szCs w:val="30"/>
+          <w:sz w:val="32"/>
+          <w:szCs w:val="32"/>
+        </w:rPr>
+      </w:pPr>
+      <w:r>
+        <w:rPr>
+          <w:rFonts w:cs="Calibri"/>
+          <w:b/>
+          <w:bCs/>
+          <w:sz w:val="32"/>
+          <w:szCs w:val="32"/>
         </w:rPr>
         <w:t>extension type</w:t>
       </w:r>
       <w:r>
         <w:rPr>
           <w:rFonts w:cs="Calibri"/>
-          <w:sz w:val="30"/>
-          <w:szCs w:val="30"/>
+          <w:sz w:val="32"/>
+          <w:szCs w:val="32"/>
         </w:rPr>
         <w:t xml:space="preserve"> in </w:t>
       </w:r>
@@ -1936,60 +1036,10 @@
           <w:rFonts w:cs="Calibri"/>
           <w:b/>
           <w:bCs/>
-          <w:sz w:val="30"/>
-          <w:szCs w:val="30"/>
+          <w:sz w:val="32"/>
+          <w:szCs w:val="32"/>
         </w:rPr>
         <w:t>Dart</w:t>
-      </w:r>
-      <w:r>
-        <w:rPr>
-          <w:rFonts w:cs="Calibri"/>
-          <w:sz w:val="30"/>
-          <w:szCs w:val="30"/>
-        </w:rPr>
-        <w:t>…………………</w:t>
-      </w:r>
-      <w:proofErr w:type="gramStart"/>
-      <w:r>
-        <w:rPr>
-          <w:rFonts w:cs="Calibri"/>
-          <w:sz w:val="30"/>
-          <w:szCs w:val="30"/>
-        </w:rPr>
-        <w:t>…..</w:t>
-      </w:r>
-      <w:proofErr w:type="gramEnd"/>
-      <w:r>
-        <w:rPr>
-          <w:rFonts w:cs="Calibri"/>
-          <w:sz w:val="30"/>
-          <w:szCs w:val="30"/>
-        </w:rPr>
-        <w:t>……</w:t>
-      </w:r>
-      <w:r>
-        <w:rPr>
-          <w:rFonts w:cs="Calibri"/>
-          <w:sz w:val="30"/>
-          <w:szCs w:val="30"/>
-        </w:rPr>
-        <w:t>……..</w:t>
-      </w:r>
-      <w:r>
-        <w:rPr>
-          <w:rFonts w:cs="Calibri"/>
-          <w:sz w:val="30"/>
-          <w:szCs w:val="30"/>
-        </w:rPr>
-        <w:t>…………………4</w:t>
-      </w:r>
-      <w:r>
-        <w:rPr>
-          <w:rFonts w:cs="Calibri"/>
-          <w:sz w:val="30"/>
-          <w:szCs w:val="30"/>
-        </w:rPr>
-        <w:t>0</w:t>
       </w:r>
     </w:p>
     <w:p>
@@ -2003,8 +1053,8 @@
           <w:rFonts w:cs="Calibri"/>
           <w:b/>
           <w:bCs/>
-          <w:sz w:val="30"/>
-          <w:szCs w:val="30"/>
+          <w:sz w:val="32"/>
+          <w:szCs w:val="32"/>
         </w:rPr>
       </w:pPr>
       <w:proofErr w:type="spellStart"/>
@@ -2014,8 +1064,8 @@
           <w:rFonts w:cs="Calibri"/>
           <w:b/>
           <w:bCs/>
-          <w:sz w:val="30"/>
-          <w:szCs w:val="30"/>
+          <w:sz w:val="32"/>
+          <w:szCs w:val="32"/>
         </w:rPr>
         <w:t>switchMap</w:t>
       </w:r>
@@ -2025,8 +1075,8 @@
           <w:rFonts w:cs="Calibri"/>
           <w:b/>
           <w:bCs/>
-          <w:sz w:val="30"/>
-          <w:szCs w:val="30"/>
+          <w:sz w:val="32"/>
+          <w:szCs w:val="32"/>
         </w:rPr>
         <w:t>(</w:t>
       </w:r>
@@ -2036,34 +1086,18 @@
           <w:rFonts w:cs="Calibri"/>
           <w:b/>
           <w:bCs/>
-          <w:sz w:val="30"/>
-          <w:szCs w:val="30"/>
+          <w:sz w:val="32"/>
+          <w:szCs w:val="32"/>
         </w:rPr>
         <w:t>)</w:t>
       </w:r>
       <w:r>
         <w:rPr>
           <w:rFonts w:cs="Calibri"/>
-          <w:sz w:val="30"/>
-          <w:szCs w:val="30"/>
-        </w:rPr>
-        <w:t xml:space="preserve"> Method…………………………………………</w:t>
-      </w:r>
-      <w:r>
-        <w:rPr>
-          <w:rFonts w:cs="Calibri"/>
-          <w:sz w:val="30"/>
-          <w:szCs w:val="30"/>
-        </w:rPr>
-        <w:t>…</w:t>
-      </w:r>
-      <w:r>
-        <w:rPr>
-          <w:rFonts w:cs="Calibri"/>
-          <w:sz w:val="30"/>
-          <w:szCs w:val="30"/>
-        </w:rPr>
-        <w:t>………….4</w:t>
+          <w:sz w:val="32"/>
+          <w:szCs w:val="32"/>
+        </w:rPr>
+        <w:t xml:space="preserve"> Method</w:t>
       </w:r>
     </w:p>
     <w:p>
@@ -2077,8 +1111,8 @@
           <w:rFonts w:cs="Calibri"/>
           <w:b/>
           <w:bCs/>
-          <w:sz w:val="30"/>
-          <w:szCs w:val="30"/>
+          <w:sz w:val="32"/>
+          <w:szCs w:val="32"/>
         </w:rPr>
       </w:pPr>
       <w:proofErr w:type="gramStart"/>
@@ -2087,8 +1121,8 @@
           <w:rFonts w:cs="Calibri"/>
           <w:b/>
           <w:bCs/>
-          <w:sz w:val="30"/>
-          <w:szCs w:val="30"/>
+          <w:sz w:val="32"/>
+          <w:szCs w:val="32"/>
         </w:rPr>
         <w:t>.then</w:t>
       </w:r>
@@ -2098,42 +1132,18 @@
           <w:rFonts w:cs="Calibri"/>
           <w:b/>
           <w:bCs/>
-          <w:sz w:val="30"/>
-          <w:szCs w:val="30"/>
+          <w:sz w:val="32"/>
+          <w:szCs w:val="32"/>
         </w:rPr>
         <w:t>()</w:t>
       </w:r>
       <w:r>
         <w:rPr>
           <w:rFonts w:cs="Calibri"/>
-          <w:sz w:val="30"/>
-          <w:szCs w:val="30"/>
-        </w:rPr>
-        <w:t xml:space="preserve"> Method………………………………………………………</w:t>
-      </w:r>
-      <w:r>
-        <w:rPr>
-          <w:rFonts w:cs="Calibri"/>
-          <w:sz w:val="30"/>
-          <w:szCs w:val="30"/>
-        </w:rPr>
-        <w:t>..</w:t>
-      </w:r>
-      <w:r>
-        <w:rPr>
-          <w:rFonts w:cs="Calibri"/>
-          <w:sz w:val="30"/>
-          <w:szCs w:val="30"/>
-        </w:rPr>
-        <w:t>……..</w:t>
-      </w:r>
-      <w:r>
-        <w:rPr>
-          <w:rFonts w:cs="Calibri"/>
-          <w:sz w:val="30"/>
-          <w:szCs w:val="30"/>
-        </w:rPr>
-        <w:t>4</w:t>
+          <w:sz w:val="32"/>
+          <w:szCs w:val="32"/>
+        </w:rPr>
+        <w:t xml:space="preserve"> Method</w:t>
       </w:r>
     </w:p>
     <w:p>
@@ -2147,8 +1157,8 @@
           <w:rFonts w:cs="Calibri"/>
           <w:b/>
           <w:bCs/>
-          <w:sz w:val="30"/>
-          <w:szCs w:val="30"/>
+          <w:sz w:val="32"/>
+          <w:szCs w:val="32"/>
         </w:rPr>
       </w:pPr>
       <w:proofErr w:type="spellStart"/>
@@ -2158,8 +1168,8 @@
           <w:rFonts w:cs="Calibri"/>
           <w:b/>
           <w:bCs/>
-          <w:sz w:val="30"/>
-          <w:szCs w:val="30"/>
+          <w:sz w:val="32"/>
+          <w:szCs w:val="32"/>
         </w:rPr>
         <w:t>runZonedGuarded</w:t>
       </w:r>
@@ -2169,8 +1179,8 @@
           <w:rFonts w:cs="Calibri"/>
           <w:b/>
           <w:bCs/>
-          <w:sz w:val="30"/>
-          <w:szCs w:val="30"/>
+          <w:sz w:val="32"/>
+          <w:szCs w:val="32"/>
         </w:rPr>
         <w:t>(</w:t>
       </w:r>
@@ -2180,42 +1190,18 @@
           <w:rFonts w:cs="Calibri"/>
           <w:b/>
           <w:bCs/>
-          <w:sz w:val="30"/>
-          <w:szCs w:val="30"/>
+          <w:sz w:val="32"/>
+          <w:szCs w:val="32"/>
         </w:rPr>
         <w:t>)</w:t>
       </w:r>
       <w:r>
         <w:rPr>
           <w:rFonts w:cs="Calibri"/>
-          <w:sz w:val="30"/>
-          <w:szCs w:val="30"/>
-        </w:rPr>
-        <w:t xml:space="preserve"> (Centralized Error Handling)…………</w:t>
-      </w:r>
-      <w:r>
-        <w:rPr>
-          <w:rFonts w:cs="Calibri"/>
-          <w:sz w:val="30"/>
-          <w:szCs w:val="30"/>
-        </w:rPr>
-        <w:t>.</w:t>
-      </w:r>
-      <w:r>
-        <w:rPr>
-          <w:rFonts w:cs="Calibri"/>
-          <w:sz w:val="30"/>
-          <w:szCs w:val="30"/>
-        </w:rPr>
-        <w:t>…….4</w:t>
-      </w:r>
-      <w:r>
-        <w:rPr>
-          <w:rFonts w:cs="Calibri"/>
-          <w:sz w:val="30"/>
-          <w:szCs w:val="30"/>
-        </w:rPr>
-        <w:t>4</w:t>
+          <w:sz w:val="32"/>
+          <w:szCs w:val="32"/>
+        </w:rPr>
+        <w:t xml:space="preserve"> (Centralized Error Handling)</w:t>
       </w:r>
     </w:p>
     <w:p>
@@ -2229,8 +1215,8 @@
           <w:rFonts w:cs="Calibri"/>
           <w:b/>
           <w:bCs/>
-          <w:sz w:val="30"/>
-          <w:szCs w:val="30"/>
+          <w:sz w:val="32"/>
+          <w:szCs w:val="32"/>
         </w:rPr>
       </w:pPr>
       <w:proofErr w:type="spellStart"/>
@@ -2239,17 +1225,18 @@
           <w:rFonts w:cs="Calibri"/>
           <w:b/>
           <w:bCs/>
-          <w:sz w:val="30"/>
-          <w:szCs w:val="30"/>
-        </w:rPr>
+          <w:sz w:val="32"/>
+          <w:szCs w:val="32"/>
+        </w:rPr>
+        <w:lastRenderedPageBreak/>
         <w:t>LinkedHashMap</w:t>
       </w:r>
       <w:proofErr w:type="spellEnd"/>
       <w:r>
         <w:rPr>
           <w:rFonts w:cs="Calibri"/>
-          <w:sz w:val="30"/>
-          <w:szCs w:val="30"/>
+          <w:sz w:val="32"/>
+          <w:szCs w:val="32"/>
         </w:rPr>
         <w:t xml:space="preserve"> in </w:t>
       </w:r>
@@ -2258,103 +1245,52 @@
           <w:rFonts w:cs="Calibri"/>
           <w:b/>
           <w:bCs/>
-          <w:sz w:val="30"/>
-          <w:szCs w:val="30"/>
+          <w:sz w:val="32"/>
+          <w:szCs w:val="32"/>
         </w:rPr>
         <w:t>Dart</w:t>
       </w:r>
-      <w:r>
-        <w:rPr>
-          <w:rFonts w:cs="Calibri"/>
-          <w:sz w:val="30"/>
-          <w:szCs w:val="30"/>
-        </w:rPr>
-        <w:t>……………………………</w:t>
-      </w:r>
-      <w:proofErr w:type="gramStart"/>
-      <w:r>
-        <w:rPr>
-          <w:rFonts w:cs="Calibri"/>
-          <w:sz w:val="30"/>
-          <w:szCs w:val="30"/>
-        </w:rPr>
-        <w:t>…</w:t>
-      </w:r>
-      <w:r>
-        <w:rPr>
-          <w:rFonts w:cs="Calibri"/>
-          <w:sz w:val="30"/>
-          <w:szCs w:val="30"/>
-        </w:rPr>
-        <w:t>..</w:t>
-      </w:r>
-      <w:proofErr w:type="gramEnd"/>
-      <w:r>
-        <w:rPr>
-          <w:rFonts w:cs="Calibri"/>
-          <w:sz w:val="30"/>
-          <w:szCs w:val="30"/>
-        </w:rPr>
-        <w:t>………………..</w:t>
-      </w:r>
-      <w:r>
-        <w:rPr>
-          <w:rFonts w:cs="Calibri"/>
-          <w:sz w:val="30"/>
-          <w:szCs w:val="30"/>
-        </w:rPr>
-        <w:t>4</w:t>
-      </w:r>
-      <w:r>
-        <w:rPr>
-          <w:rFonts w:cs="Calibri"/>
-          <w:sz w:val="30"/>
-          <w:szCs w:val="30"/>
-        </w:rPr>
-        <w:t>6</w:t>
-      </w:r>
-    </w:p>
-    <w:p>
-      <w:pPr>
-        <w:rPr>
-          <w:rFonts w:cs="Calibri"/>
-          <w:b/>
-          <w:bCs/>
-          <w:sz w:val="30"/>
-          <w:szCs w:val="30"/>
-        </w:rPr>
-      </w:pPr>
-    </w:p>
-    <w:p>
-      <w:pPr>
-        <w:rPr>
-          <w:rFonts w:cs="Calibri"/>
-          <w:b/>
-          <w:bCs/>
-          <w:sz w:val="30"/>
-          <w:szCs w:val="30"/>
-        </w:rPr>
-      </w:pPr>
-    </w:p>
-    <w:p>
-      <w:pPr>
-        <w:jc w:val="both"/>
-        <w:rPr>
-          <w:rFonts w:cs="Calibri"/>
-          <w:b/>
-          <w:bCs/>
-          <w:sz w:val="32"/>
-          <w:szCs w:val="32"/>
-        </w:rPr>
-      </w:pPr>
-      <w:r>
-        <w:rPr>
-          <w:rFonts w:cs="Calibri"/>
-          <w:b/>
-          <w:bCs/>
-          <w:sz w:val="32"/>
-          <w:szCs w:val="32"/>
-        </w:rPr>
+    </w:p>
+    <w:p>
+      <w:pPr>
+        <w:rPr>
+          <w:rFonts w:cs="Calibri"/>
+          <w:b/>
+          <w:bCs/>
+          <w:sz w:val="32"/>
+          <w:szCs w:val="32"/>
+        </w:rPr>
+      </w:pPr>
+      <w:r>
+        <w:rPr>
+          <w:rFonts w:cs="Calibri"/>
+          <w:b/>
+          <w:bCs/>
+          <w:sz w:val="32"/>
+          <w:szCs w:val="32"/>
+        </w:rPr>
+        <w:br w:type="page"/>
+      </w:r>
+    </w:p>
+    <w:p>
+      <w:pPr>
+        <w:rPr>
+          <w:rFonts w:cs="Calibri"/>
+          <w:b/>
+          <w:bCs/>
+          <w:sz w:val="32"/>
+          <w:szCs w:val="32"/>
+        </w:rPr>
+      </w:pPr>
+      <w:r>
+        <w:rPr>
+          <w:rFonts w:cs="Calibri"/>
+          <w:b/>
+          <w:bCs/>
+          <w:sz w:val="32"/>
+          <w:szCs w:val="32"/>
+        </w:rPr>
+        <w:lastRenderedPageBreak/>
         <w:t>Quick Tips</w:t>
       </w:r>
       <w:r>
@@ -3533,140 +2469,140 @@
           <w:sz w:val="32"/>
           <w:szCs w:val="32"/>
         </w:rPr>
+        <w:t xml:space="preserve">// returns </w:t>
+      </w:r>
+      <w:proofErr w:type="spellStart"/>
+      <w:r>
+        <w:rPr>
+          <w:rFonts w:cs="Calibri"/>
+          <w:b/>
+          <w:bCs/>
+          <w:color w:val="D86DCB" w:themeColor="accent5" w:themeTint="99"/>
+          <w:sz w:val="32"/>
+          <w:szCs w:val="32"/>
+        </w:rPr>
+        <w:t>Iterable</w:t>
+      </w:r>
+      <w:proofErr w:type="spellEnd"/>
+      <w:r>
+        <w:rPr>
+          <w:rFonts w:cs="Calibri"/>
+          <w:b/>
+          <w:bCs/>
+          <w:color w:val="D86DCB" w:themeColor="accent5" w:themeTint="99"/>
+          <w:sz w:val="32"/>
+          <w:szCs w:val="32"/>
+        </w:rPr>
+        <w:t>&lt;</w:t>
+      </w:r>
+      <w:proofErr w:type="spellStart"/>
+      <w:r>
+        <w:rPr>
+          <w:rFonts w:cs="Calibri"/>
+          <w:b/>
+          <w:bCs/>
+          <w:color w:val="D86DCB" w:themeColor="accent5" w:themeTint="99"/>
+          <w:sz w:val="32"/>
+          <w:szCs w:val="32"/>
+        </w:rPr>
+        <w:t>HomeSliderModel</w:t>
+      </w:r>
+      <w:proofErr w:type="spellEnd"/>
+      <w:r>
+        <w:rPr>
+          <w:rFonts w:cs="Calibri"/>
+          <w:b/>
+          <w:bCs/>
+          <w:color w:val="D86DCB" w:themeColor="accent5" w:themeTint="99"/>
+          <w:sz w:val="32"/>
+          <w:szCs w:val="32"/>
+        </w:rPr>
+        <w:t>&gt; — lazy, no data yet</w:t>
+      </w:r>
+    </w:p>
+    <w:p>
+      <w:pPr>
+        <w:jc w:val="both"/>
+        <w:rPr>
+          <w:rFonts w:cs="Calibri"/>
+          <w:b/>
+          <w:bCs/>
+          <w:color w:val="D86DCB" w:themeColor="accent5" w:themeTint="99"/>
+          <w:sz w:val="32"/>
+          <w:szCs w:val="32"/>
+        </w:rPr>
+      </w:pPr>
+      <w:proofErr w:type="spellStart"/>
+      <w:r>
+        <w:rPr>
+          <w:rFonts w:cs="Calibri"/>
+          <w:b/>
+          <w:bCs/>
+          <w:color w:val="D86DCB" w:themeColor="accent5" w:themeTint="99"/>
+          <w:sz w:val="32"/>
+          <w:szCs w:val="32"/>
+        </w:rPr>
+        <w:t>data.map</w:t>
+      </w:r>
+      <w:proofErr w:type="spellEnd"/>
+      <w:r>
+        <w:rPr>
+          <w:rFonts w:cs="Calibri"/>
+          <w:b/>
+          <w:bCs/>
+          <w:color w:val="D86DCB" w:themeColor="accent5" w:themeTint="99"/>
+          <w:sz w:val="32"/>
+          <w:szCs w:val="32"/>
+        </w:rPr>
+        <w:t xml:space="preserve">((e) =&gt; </w:t>
+      </w:r>
+      <w:proofErr w:type="spellStart"/>
+      <w:r>
+        <w:rPr>
+          <w:rFonts w:cs="Calibri"/>
+          <w:b/>
+          <w:bCs/>
+          <w:color w:val="D86DCB" w:themeColor="accent5" w:themeTint="99"/>
+          <w:sz w:val="32"/>
+          <w:szCs w:val="32"/>
+        </w:rPr>
+        <w:t>HomeSliderModel.fromJson</w:t>
+      </w:r>
+      <w:proofErr w:type="spellEnd"/>
+      <w:r>
+        <w:rPr>
+          <w:rFonts w:cs="Calibri"/>
+          <w:b/>
+          <w:bCs/>
+          <w:color w:val="D86DCB" w:themeColor="accent5" w:themeTint="99"/>
+          <w:sz w:val="32"/>
+          <w:szCs w:val="32"/>
+        </w:rPr>
+        <w:t>(e))</w:t>
+      </w:r>
+    </w:p>
+    <w:p>
+      <w:pPr>
+        <w:jc w:val="both"/>
+        <w:rPr>
+          <w:rFonts w:cs="Calibri"/>
+          <w:b/>
+          <w:bCs/>
+          <w:color w:val="D86DCB" w:themeColor="accent5" w:themeTint="99"/>
+          <w:sz w:val="32"/>
+          <w:szCs w:val="32"/>
+        </w:rPr>
+      </w:pPr>
+      <w:r>
+        <w:rPr>
+          <w:rFonts w:cs="Calibri"/>
+          <w:b/>
+          <w:bCs/>
+          <w:color w:val="D86DCB" w:themeColor="accent5" w:themeTint="99"/>
+          <w:sz w:val="32"/>
+          <w:szCs w:val="32"/>
+        </w:rPr>
         <w:lastRenderedPageBreak/>
-        <w:t xml:space="preserve">// returns </w:t>
-      </w:r>
-      <w:proofErr w:type="spellStart"/>
-      <w:r>
-        <w:rPr>
-          <w:rFonts w:cs="Calibri"/>
-          <w:b/>
-          <w:bCs/>
-          <w:color w:val="D86DCB" w:themeColor="accent5" w:themeTint="99"/>
-          <w:sz w:val="32"/>
-          <w:szCs w:val="32"/>
-        </w:rPr>
-        <w:t>Iterable</w:t>
-      </w:r>
-      <w:proofErr w:type="spellEnd"/>
-      <w:r>
-        <w:rPr>
-          <w:rFonts w:cs="Calibri"/>
-          <w:b/>
-          <w:bCs/>
-          <w:color w:val="D86DCB" w:themeColor="accent5" w:themeTint="99"/>
-          <w:sz w:val="32"/>
-          <w:szCs w:val="32"/>
-        </w:rPr>
-        <w:t>&lt;</w:t>
-      </w:r>
-      <w:proofErr w:type="spellStart"/>
-      <w:r>
-        <w:rPr>
-          <w:rFonts w:cs="Calibri"/>
-          <w:b/>
-          <w:bCs/>
-          <w:color w:val="D86DCB" w:themeColor="accent5" w:themeTint="99"/>
-          <w:sz w:val="32"/>
-          <w:szCs w:val="32"/>
-        </w:rPr>
-        <w:t>HomeSliderModel</w:t>
-      </w:r>
-      <w:proofErr w:type="spellEnd"/>
-      <w:r>
-        <w:rPr>
-          <w:rFonts w:cs="Calibri"/>
-          <w:b/>
-          <w:bCs/>
-          <w:color w:val="D86DCB" w:themeColor="accent5" w:themeTint="99"/>
-          <w:sz w:val="32"/>
-          <w:szCs w:val="32"/>
-        </w:rPr>
-        <w:t>&gt; — lazy, no data yet</w:t>
-      </w:r>
-    </w:p>
-    <w:p>
-      <w:pPr>
-        <w:jc w:val="both"/>
-        <w:rPr>
-          <w:rFonts w:cs="Calibri"/>
-          <w:b/>
-          <w:bCs/>
-          <w:color w:val="D86DCB" w:themeColor="accent5" w:themeTint="99"/>
-          <w:sz w:val="32"/>
-          <w:szCs w:val="32"/>
-        </w:rPr>
-      </w:pPr>
-      <w:proofErr w:type="spellStart"/>
-      <w:r>
-        <w:rPr>
-          <w:rFonts w:cs="Calibri"/>
-          <w:b/>
-          <w:bCs/>
-          <w:color w:val="D86DCB" w:themeColor="accent5" w:themeTint="99"/>
-          <w:sz w:val="32"/>
-          <w:szCs w:val="32"/>
-        </w:rPr>
-        <w:t>data.map</w:t>
-      </w:r>
-      <w:proofErr w:type="spellEnd"/>
-      <w:r>
-        <w:rPr>
-          <w:rFonts w:cs="Calibri"/>
-          <w:b/>
-          <w:bCs/>
-          <w:color w:val="D86DCB" w:themeColor="accent5" w:themeTint="99"/>
-          <w:sz w:val="32"/>
-          <w:szCs w:val="32"/>
-        </w:rPr>
-        <w:t xml:space="preserve">((e) =&gt; </w:t>
-      </w:r>
-      <w:proofErr w:type="spellStart"/>
-      <w:r>
-        <w:rPr>
-          <w:rFonts w:cs="Calibri"/>
-          <w:b/>
-          <w:bCs/>
-          <w:color w:val="D86DCB" w:themeColor="accent5" w:themeTint="99"/>
-          <w:sz w:val="32"/>
-          <w:szCs w:val="32"/>
-        </w:rPr>
-        <w:t>HomeSliderModel.fromJson</w:t>
-      </w:r>
-      <w:proofErr w:type="spellEnd"/>
-      <w:r>
-        <w:rPr>
-          <w:rFonts w:cs="Calibri"/>
-          <w:b/>
-          <w:bCs/>
-          <w:color w:val="D86DCB" w:themeColor="accent5" w:themeTint="99"/>
-          <w:sz w:val="32"/>
-          <w:szCs w:val="32"/>
-        </w:rPr>
-        <w:t>(e))</w:t>
-      </w:r>
-    </w:p>
-    <w:p>
-      <w:pPr>
-        <w:jc w:val="both"/>
-        <w:rPr>
-          <w:rFonts w:cs="Calibri"/>
-          <w:b/>
-          <w:bCs/>
-          <w:color w:val="D86DCB" w:themeColor="accent5" w:themeTint="99"/>
-          <w:sz w:val="32"/>
-          <w:szCs w:val="32"/>
-        </w:rPr>
-      </w:pPr>
-      <w:r>
-        <w:rPr>
-          <w:rFonts w:cs="Calibri"/>
-          <w:b/>
-          <w:bCs/>
-          <w:color w:val="D86DCB" w:themeColor="accent5" w:themeTint="99"/>
-          <w:sz w:val="32"/>
-          <w:szCs w:val="32"/>
-        </w:rPr>
         <w:t>// returns List&lt;</w:t>
       </w:r>
       <w:proofErr w:type="spellStart"/>
@@ -4602,182 +3538,190 @@
           <w:sz w:val="32"/>
           <w:szCs w:val="32"/>
         </w:rPr>
+        <w:t xml:space="preserve">NOTE: </w:t>
+      </w:r>
+      <w:r>
+        <w:rPr>
+          <w:rFonts w:cs="Calibri"/>
+          <w:sz w:val="32"/>
+          <w:szCs w:val="32"/>
+        </w:rPr>
+        <w:t xml:space="preserve">Don’t </w:t>
+      </w:r>
+      <w:proofErr w:type="gramStart"/>
+      <w:r>
+        <w:rPr>
+          <w:rFonts w:cs="Calibri"/>
+          <w:sz w:val="32"/>
+          <w:szCs w:val="32"/>
+        </w:rPr>
+        <w:t>use</w:t>
+      </w:r>
+      <w:r>
+        <w:rPr>
+          <w:rFonts w:cs="Calibri"/>
+          <w:b/>
+          <w:bCs/>
+          <w:sz w:val="32"/>
+          <w:szCs w:val="32"/>
+        </w:rPr>
+        <w:t xml:space="preserve"> .map</w:t>
+      </w:r>
+      <w:proofErr w:type="gramEnd"/>
+      <w:r>
+        <w:rPr>
+          <w:rFonts w:cs="Calibri"/>
+          <w:b/>
+          <w:bCs/>
+          <w:sz w:val="32"/>
+          <w:szCs w:val="32"/>
+        </w:rPr>
+        <w:t>()</w:t>
+      </w:r>
+      <w:r>
+        <w:rPr>
+          <w:rFonts w:cs="Calibri"/>
+          <w:sz w:val="32"/>
+          <w:szCs w:val="32"/>
+        </w:rPr>
+        <w:t xml:space="preserve"> method </w:t>
+      </w:r>
+      <w:r>
+        <w:rPr>
+          <w:rFonts w:cs="Calibri"/>
+          <w:sz w:val="32"/>
+          <w:szCs w:val="32"/>
+        </w:rPr>
+        <w:t>for</w:t>
+      </w:r>
+      <w:r>
+        <w:rPr>
+          <w:rFonts w:cs="Calibri"/>
+          <w:sz w:val="32"/>
+          <w:szCs w:val="32"/>
+        </w:rPr>
+        <w:t xml:space="preserve"> calculating</w:t>
+      </w:r>
+      <w:r>
+        <w:rPr>
+          <w:rFonts w:cs="Calibri"/>
+          <w:b/>
+          <w:bCs/>
+          <w:sz w:val="32"/>
+          <w:szCs w:val="32"/>
+        </w:rPr>
+        <w:t xml:space="preserve"> total</w:t>
+      </w:r>
+      <w:r>
+        <w:rPr>
+          <w:rFonts w:cs="Calibri"/>
+          <w:sz w:val="32"/>
+          <w:szCs w:val="32"/>
+        </w:rPr>
+        <w:t xml:space="preserve"> number of price from a </w:t>
+      </w:r>
+      <w:r>
+        <w:rPr>
+          <w:rFonts w:cs="Calibri"/>
+          <w:b/>
+          <w:bCs/>
+          <w:sz w:val="32"/>
+          <w:szCs w:val="32"/>
+        </w:rPr>
+        <w:t>List</w:t>
+      </w:r>
+      <w:r>
+        <w:rPr>
+          <w:rFonts w:cs="Calibri"/>
+          <w:sz w:val="32"/>
+          <w:szCs w:val="32"/>
+        </w:rPr>
+        <w:t xml:space="preserve"> of objects. The total price won’t show up </w:t>
+      </w:r>
+      <w:proofErr w:type="gramStart"/>
+      <w:r>
+        <w:rPr>
+          <w:rFonts w:cs="Calibri"/>
+          <w:sz w:val="32"/>
+          <w:szCs w:val="32"/>
+        </w:rPr>
+        <w:t>because</w:t>
+      </w:r>
+      <w:r>
+        <w:rPr>
+          <w:rFonts w:cs="Calibri"/>
+          <w:sz w:val="32"/>
+          <w:szCs w:val="32"/>
+        </w:rPr>
+        <w:t xml:space="preserve"> </w:t>
+      </w:r>
+      <w:r>
+        <w:rPr>
+          <w:rFonts w:cs="Calibri"/>
+          <w:b/>
+          <w:bCs/>
+          <w:sz w:val="32"/>
+          <w:szCs w:val="32"/>
+        </w:rPr>
+        <w:t>.map</w:t>
+      </w:r>
+      <w:proofErr w:type="gramEnd"/>
+      <w:r>
+        <w:rPr>
+          <w:rFonts w:cs="Calibri"/>
+          <w:b/>
+          <w:bCs/>
+          <w:sz w:val="32"/>
+          <w:szCs w:val="32"/>
+        </w:rPr>
+        <w:t>()</w:t>
+      </w:r>
+      <w:r>
+        <w:rPr>
+          <w:rFonts w:cs="Calibri"/>
+          <w:sz w:val="32"/>
+          <w:szCs w:val="32"/>
+        </w:rPr>
+        <w:t xml:space="preserve"> method doesn't actually execute the code inside its closure immediately. Instead, it returns a "lazy" </w:t>
+      </w:r>
+      <w:proofErr w:type="spellStart"/>
+      <w:r>
+        <w:rPr>
+          <w:rFonts w:cs="Calibri"/>
+          <w:b/>
+          <w:bCs/>
+          <w:sz w:val="32"/>
+          <w:szCs w:val="32"/>
+        </w:rPr>
+        <w:t>Iterable</w:t>
+      </w:r>
+      <w:proofErr w:type="spellEnd"/>
+      <w:r>
+        <w:rPr>
+          <w:rFonts w:cs="Calibri"/>
+          <w:b/>
+          <w:bCs/>
+          <w:sz w:val="32"/>
+          <w:szCs w:val="32"/>
+        </w:rPr>
+        <w:t>&lt;T&gt;</w:t>
+      </w:r>
+      <w:r>
+        <w:rPr>
+          <w:rFonts w:cs="Calibri"/>
+          <w:sz w:val="32"/>
+          <w:szCs w:val="32"/>
+        </w:rPr>
+        <w:t xml:space="preserve">. The </w:t>
+      </w:r>
+      <w:r>
+        <w:rPr>
+          <w:rFonts w:cs="Calibri"/>
+          <w:sz w:val="32"/>
+          <w:szCs w:val="32"/>
+        </w:rPr>
         <w:lastRenderedPageBreak/>
-        <w:t xml:space="preserve">NOTE: </w:t>
-      </w:r>
-      <w:r>
-        <w:rPr>
-          <w:rFonts w:cs="Calibri"/>
-          <w:sz w:val="32"/>
-          <w:szCs w:val="32"/>
-        </w:rPr>
-        <w:t xml:space="preserve">Don’t </w:t>
-      </w:r>
-      <w:proofErr w:type="gramStart"/>
-      <w:r>
-        <w:rPr>
-          <w:rFonts w:cs="Calibri"/>
-          <w:sz w:val="32"/>
-          <w:szCs w:val="32"/>
-        </w:rPr>
-        <w:t>use</w:t>
-      </w:r>
-      <w:r>
-        <w:rPr>
-          <w:rFonts w:cs="Calibri"/>
-          <w:b/>
-          <w:bCs/>
-          <w:sz w:val="32"/>
-          <w:szCs w:val="32"/>
-        </w:rPr>
-        <w:t xml:space="preserve"> .map</w:t>
-      </w:r>
-      <w:proofErr w:type="gramEnd"/>
-      <w:r>
-        <w:rPr>
-          <w:rFonts w:cs="Calibri"/>
-          <w:b/>
-          <w:bCs/>
-          <w:sz w:val="32"/>
-          <w:szCs w:val="32"/>
-        </w:rPr>
-        <w:t>()</w:t>
-      </w:r>
-      <w:r>
-        <w:rPr>
-          <w:rFonts w:cs="Calibri"/>
-          <w:sz w:val="32"/>
-          <w:szCs w:val="32"/>
-        </w:rPr>
-        <w:t xml:space="preserve"> method </w:t>
-      </w:r>
-      <w:r>
-        <w:rPr>
-          <w:rFonts w:cs="Calibri"/>
-          <w:sz w:val="32"/>
-          <w:szCs w:val="32"/>
-        </w:rPr>
-        <w:t>for</w:t>
-      </w:r>
-      <w:r>
-        <w:rPr>
-          <w:rFonts w:cs="Calibri"/>
-          <w:sz w:val="32"/>
-          <w:szCs w:val="32"/>
-        </w:rPr>
-        <w:t xml:space="preserve"> calculating</w:t>
-      </w:r>
-      <w:r>
-        <w:rPr>
-          <w:rFonts w:cs="Calibri"/>
-          <w:b/>
-          <w:bCs/>
-          <w:sz w:val="32"/>
-          <w:szCs w:val="32"/>
-        </w:rPr>
-        <w:t xml:space="preserve"> total</w:t>
-      </w:r>
-      <w:r>
-        <w:rPr>
-          <w:rFonts w:cs="Calibri"/>
-          <w:sz w:val="32"/>
-          <w:szCs w:val="32"/>
-        </w:rPr>
-        <w:t xml:space="preserve"> number of price from a </w:t>
-      </w:r>
-      <w:r>
-        <w:rPr>
-          <w:rFonts w:cs="Calibri"/>
-          <w:b/>
-          <w:bCs/>
-          <w:sz w:val="32"/>
-          <w:szCs w:val="32"/>
-        </w:rPr>
-        <w:t>List</w:t>
-      </w:r>
-      <w:r>
-        <w:rPr>
-          <w:rFonts w:cs="Calibri"/>
-          <w:sz w:val="32"/>
-          <w:szCs w:val="32"/>
-        </w:rPr>
-        <w:t xml:space="preserve"> of objects. The total price won’t show up </w:t>
-      </w:r>
-      <w:proofErr w:type="gramStart"/>
-      <w:r>
-        <w:rPr>
-          <w:rFonts w:cs="Calibri"/>
-          <w:sz w:val="32"/>
-          <w:szCs w:val="32"/>
-        </w:rPr>
-        <w:t>because</w:t>
-      </w:r>
-      <w:r>
-        <w:rPr>
-          <w:rFonts w:cs="Calibri"/>
-          <w:sz w:val="32"/>
-          <w:szCs w:val="32"/>
-        </w:rPr>
-        <w:t xml:space="preserve"> </w:t>
-      </w:r>
-      <w:r>
-        <w:rPr>
-          <w:rFonts w:cs="Calibri"/>
-          <w:b/>
-          <w:bCs/>
-          <w:sz w:val="32"/>
-          <w:szCs w:val="32"/>
-        </w:rPr>
-        <w:t>.map</w:t>
-      </w:r>
-      <w:proofErr w:type="gramEnd"/>
-      <w:r>
-        <w:rPr>
-          <w:rFonts w:cs="Calibri"/>
-          <w:b/>
-          <w:bCs/>
-          <w:sz w:val="32"/>
-          <w:szCs w:val="32"/>
-        </w:rPr>
-        <w:t>()</w:t>
-      </w:r>
-      <w:r>
-        <w:rPr>
-          <w:rFonts w:cs="Calibri"/>
-          <w:sz w:val="32"/>
-          <w:szCs w:val="32"/>
-        </w:rPr>
-        <w:t xml:space="preserve"> method doesn't actually execute the code inside its closure immediately. Instead, it returns a "lazy" </w:t>
-      </w:r>
-      <w:proofErr w:type="spellStart"/>
-      <w:r>
-        <w:rPr>
-          <w:rFonts w:cs="Calibri"/>
-          <w:b/>
-          <w:bCs/>
-          <w:sz w:val="32"/>
-          <w:szCs w:val="32"/>
-        </w:rPr>
-        <w:t>Iterable</w:t>
-      </w:r>
-      <w:proofErr w:type="spellEnd"/>
-      <w:r>
-        <w:rPr>
-          <w:rFonts w:cs="Calibri"/>
-          <w:b/>
-          <w:bCs/>
-          <w:sz w:val="32"/>
-          <w:szCs w:val="32"/>
-        </w:rPr>
-        <w:t>&lt;T&gt;</w:t>
-      </w:r>
-      <w:r>
-        <w:rPr>
-          <w:rFonts w:cs="Calibri"/>
-          <w:sz w:val="32"/>
-          <w:szCs w:val="32"/>
-        </w:rPr>
-        <w:t xml:space="preserve">. The transformation (and in our case, the side effect of adding to </w:t>
+        <w:t xml:space="preserve">transformation (and in our case, the side effect of adding to </w:t>
       </w:r>
       <w:r>
         <w:rPr>
@@ -5599,7 +4543,6 @@
           <w:sz w:val="32"/>
           <w:szCs w:val="32"/>
         </w:rPr>
-        <w:lastRenderedPageBreak/>
         <w:t xml:space="preserve">Type Flexibility: The return type can differ from the element type of the collection (e.g., calculating the sum of </w:t>
       </w:r>
       <w:r>
@@ -5683,6 +4626,7 @@
           <w:sz w:val="32"/>
           <w:szCs w:val="32"/>
         </w:rPr>
+        <w:lastRenderedPageBreak/>
         <w:t xml:space="preserve">  List&lt;int&gt; list1 = [</w:t>
       </w:r>
       <w:proofErr w:type="gramStart"/>
@@ -6350,7 +5294,6 @@
           <w:sz w:val="32"/>
           <w:szCs w:val="32"/>
         </w:rPr>
-        <w:lastRenderedPageBreak/>
         <w:t xml:space="preserve">Otherwise, it returns </w:t>
       </w:r>
       <w:r>
@@ -6439,6 +5382,7 @@
           <w:sz w:val="32"/>
           <w:szCs w:val="32"/>
         </w:rPr>
+        <w:lastRenderedPageBreak/>
         <w:t>N</w:t>
       </w:r>
       <w:r>
@@ -7357,7 +6301,67 @@
           <w:sz w:val="32"/>
           <w:szCs w:val="32"/>
         </w:rPr>
+        <w:t>.remainder</w:t>
+      </w:r>
+      <w:proofErr w:type="gramEnd"/>
+      <w:r>
+        <w:rPr>
+          <w:rFonts w:cs="Calibri"/>
+          <w:b/>
+          <w:bCs/>
+          <w:sz w:val="32"/>
+          <w:szCs w:val="32"/>
+        </w:rPr>
+        <w:t xml:space="preserve">() </w:t>
+      </w:r>
+      <w:r>
+        <w:rPr>
+          <w:rFonts w:cs="Calibri"/>
+          <w:b/>
+          <w:bCs/>
+          <w:sz w:val="32"/>
+          <w:szCs w:val="32"/>
+        </w:rPr>
+        <w:t>M</w:t>
+      </w:r>
+      <w:r>
+        <w:rPr>
+          <w:rFonts w:cs="Calibri"/>
+          <w:b/>
+          <w:bCs/>
+          <w:sz w:val="32"/>
+          <w:szCs w:val="32"/>
+        </w:rPr>
+        <w:t>ethod:</w:t>
+      </w:r>
+    </w:p>
+    <w:p>
+      <w:pPr>
+        <w:jc w:val="both"/>
+        <w:rPr>
+          <w:rFonts w:cs="Calibri"/>
+          <w:sz w:val="32"/>
+          <w:szCs w:val="32"/>
+        </w:rPr>
+      </w:pPr>
+      <w:proofErr w:type="gramStart"/>
+      <w:r>
+        <w:rPr>
+          <w:rFonts w:cs="Calibri"/>
+          <w:sz w:val="32"/>
+          <w:szCs w:val="32"/>
+        </w:rPr>
         <w:lastRenderedPageBreak/>
+        <w:t xml:space="preserve"># </w:t>
+      </w:r>
+      <w:r>
+        <w:rPr>
+          <w:rFonts w:cs="Calibri"/>
+          <w:b/>
+          <w:bCs/>
+          <w:sz w:val="32"/>
+          <w:szCs w:val="32"/>
+        </w:rPr>
         <w:t>.remainder</w:t>
       </w:r>
       <w:proofErr w:type="gramEnd"/>
@@ -7369,7 +6373,589 @@
           <w:sz w:val="32"/>
           <w:szCs w:val="32"/>
         </w:rPr>
-        <w:t xml:space="preserve">() </w:t>
+        <w:t>()</w:t>
+      </w:r>
+      <w:r>
+        <w:rPr>
+          <w:rFonts w:cs="Calibri"/>
+          <w:sz w:val="32"/>
+          <w:szCs w:val="32"/>
+        </w:rPr>
+        <w:t xml:space="preserve"> method gives us a number, after taking (specified in the parameter) whatever is LEFT. Especially useful with </w:t>
+      </w:r>
+      <w:proofErr w:type="gramStart"/>
+      <w:r>
+        <w:rPr>
+          <w:rFonts w:cs="Calibri"/>
+          <w:b/>
+          <w:bCs/>
+          <w:sz w:val="32"/>
+          <w:szCs w:val="32"/>
+        </w:rPr>
+        <w:t>Duration(</w:t>
+      </w:r>
+      <w:proofErr w:type="gramEnd"/>
+      <w:r>
+        <w:rPr>
+          <w:rFonts w:cs="Calibri"/>
+          <w:b/>
+          <w:bCs/>
+          <w:sz w:val="32"/>
+          <w:szCs w:val="32"/>
+        </w:rPr>
+        <w:t>)</w:t>
+      </w:r>
+      <w:r>
+        <w:rPr>
+          <w:rFonts w:cs="Calibri"/>
+          <w:sz w:val="32"/>
+          <w:szCs w:val="32"/>
+        </w:rPr>
+        <w:t xml:space="preserve"> class we can take whatever seconds are LEFT after taking minutes. </w:t>
+      </w:r>
+      <w:proofErr w:type="gramStart"/>
+      <w:r>
+        <w:rPr>
+          <w:rFonts w:cs="Calibri"/>
+          <w:sz w:val="32"/>
+          <w:szCs w:val="32"/>
+        </w:rPr>
+        <w:t xml:space="preserve">Like </w:t>
+      </w:r>
+      <w:r>
+        <w:rPr>
+          <w:rFonts w:cs="Calibri"/>
+          <w:b/>
+          <w:bCs/>
+          <w:sz w:val="32"/>
+          <w:szCs w:val="32"/>
+        </w:rPr>
+        <w:t>.remainder</w:t>
+      </w:r>
+      <w:proofErr w:type="gramEnd"/>
+      <w:r>
+        <w:rPr>
+          <w:rFonts w:cs="Calibri"/>
+          <w:b/>
+          <w:bCs/>
+          <w:sz w:val="32"/>
+          <w:szCs w:val="32"/>
+        </w:rPr>
+        <w:t>(60)</w:t>
+      </w:r>
+      <w:r>
+        <w:rPr>
+          <w:rFonts w:cs="Calibri"/>
+          <w:sz w:val="32"/>
+          <w:szCs w:val="32"/>
+        </w:rPr>
+        <w:t>, example:</w:t>
+      </w:r>
+    </w:p>
+    <w:p>
+      <w:pPr>
+        <w:jc w:val="both"/>
+        <w:rPr>
+          <w:rFonts w:cs="Calibri"/>
+          <w:b/>
+          <w:bCs/>
+          <w:sz w:val="32"/>
+          <w:szCs w:val="32"/>
+        </w:rPr>
+      </w:pPr>
+      <w:r>
+        <w:rPr>
+          <w:rFonts w:cs="Calibri"/>
+          <w:b/>
+          <w:bCs/>
+          <w:sz w:val="32"/>
+          <w:szCs w:val="32"/>
+        </w:rPr>
+        <w:t>140 % 60 = 20</w:t>
+      </w:r>
+    </w:p>
+    <w:p>
+      <w:pPr>
+        <w:jc w:val="both"/>
+        <w:rPr>
+          <w:rFonts w:cs="Calibri"/>
+          <w:sz w:val="32"/>
+          <w:szCs w:val="32"/>
+        </w:rPr>
+      </w:pPr>
+      <w:r>
+        <w:rPr>
+          <w:rFonts w:cs="Calibri"/>
+          <w:sz w:val="32"/>
+          <w:szCs w:val="32"/>
+        </w:rPr>
+        <w:t xml:space="preserve"># So, after taking 60 two times or minutes 20 seconds are left and that is returned. But IN REALITY, it follows this, the remainder of the truncating division of </w:t>
+      </w:r>
+      <w:r>
+        <w:rPr>
+          <w:rFonts w:cs="Calibri"/>
+          <w:b/>
+          <w:bCs/>
+          <w:sz w:val="32"/>
+          <w:szCs w:val="32"/>
+        </w:rPr>
+        <w:t>this</w:t>
+      </w:r>
+      <w:r>
+        <w:rPr>
+          <w:rFonts w:cs="Calibri"/>
+          <w:sz w:val="32"/>
+          <w:szCs w:val="32"/>
+        </w:rPr>
+        <w:t xml:space="preserve"> by </w:t>
+      </w:r>
+      <w:r>
+        <w:rPr>
+          <w:rFonts w:cs="Calibri"/>
+          <w:b/>
+          <w:bCs/>
+          <w:sz w:val="32"/>
+          <w:szCs w:val="32"/>
+        </w:rPr>
+        <w:t>other</w:t>
+      </w:r>
+      <w:r>
+        <w:rPr>
+          <w:rFonts w:cs="Calibri"/>
+          <w:sz w:val="32"/>
+          <w:szCs w:val="32"/>
+        </w:rPr>
+        <w:t xml:space="preserve">. The result </w:t>
+      </w:r>
+      <w:r>
+        <w:rPr>
+          <w:rFonts w:cs="Calibri"/>
+          <w:b/>
+          <w:bCs/>
+          <w:sz w:val="32"/>
+          <w:szCs w:val="32"/>
+        </w:rPr>
+        <w:t>r</w:t>
+      </w:r>
+      <w:r>
+        <w:rPr>
+          <w:rFonts w:cs="Calibri"/>
+          <w:sz w:val="32"/>
+          <w:szCs w:val="32"/>
+        </w:rPr>
+        <w:t xml:space="preserve"> of this method satisfies:</w:t>
+      </w:r>
+    </w:p>
+    <w:p>
+      <w:pPr>
+        <w:jc w:val="both"/>
+        <w:rPr>
+          <w:rFonts w:cs="Calibri"/>
+          <w:b/>
+          <w:bCs/>
+          <w:sz w:val="32"/>
+          <w:szCs w:val="32"/>
+        </w:rPr>
+      </w:pPr>
+      <w:r>
+        <w:rPr>
+          <w:rFonts w:cs="Calibri"/>
+          <w:b/>
+          <w:bCs/>
+          <w:sz w:val="32"/>
+          <w:szCs w:val="32"/>
+        </w:rPr>
+        <w:t>this == (this ~/ other) * other + r</w:t>
+      </w:r>
+    </w:p>
+    <w:p>
+      <w:pPr>
+        <w:jc w:val="both"/>
+        <w:rPr>
+          <w:rFonts w:cs="Calibri"/>
+          <w:b/>
+          <w:bCs/>
+          <w:sz w:val="32"/>
+          <w:szCs w:val="32"/>
+        </w:rPr>
+      </w:pPr>
+      <w:r>
+        <w:rPr>
+          <w:rFonts w:cs="Calibri"/>
+          <w:b/>
+          <w:bCs/>
+          <w:sz w:val="32"/>
+          <w:szCs w:val="32"/>
+        </w:rPr>
+        <w:t>140 == (140 ~/ 60) * 60 + 20</w:t>
+      </w:r>
+    </w:p>
+    <w:p>
+      <w:pPr>
+        <w:jc w:val="both"/>
+        <w:rPr>
+          <w:rFonts w:cs="Calibri"/>
+          <w:sz w:val="32"/>
+          <w:szCs w:val="32"/>
+        </w:rPr>
+      </w:pPr>
+      <w:r>
+        <w:rPr>
+          <w:rFonts w:cs="Calibri"/>
+          <w:sz w:val="32"/>
+          <w:szCs w:val="32"/>
+        </w:rPr>
+        <w:t># Code</w:t>
+      </w:r>
+    </w:p>
+    <w:p>
+      <w:pPr>
+        <w:jc w:val="both"/>
+        <w:rPr>
+          <w:rFonts w:cs="Calibri"/>
+          <w:b/>
+          <w:bCs/>
+          <w:color w:val="D86DCB" w:themeColor="accent5" w:themeTint="99"/>
+          <w:sz w:val="32"/>
+          <w:szCs w:val="32"/>
+        </w:rPr>
+      </w:pPr>
+      <w:r>
+        <w:rPr>
+          <w:rFonts w:cs="Calibri"/>
+          <w:b/>
+          <w:bCs/>
+          <w:color w:val="D86DCB" w:themeColor="accent5" w:themeTint="99"/>
+          <w:sz w:val="32"/>
+          <w:szCs w:val="32"/>
+        </w:rPr>
+        <w:t>print(</w:t>
+      </w:r>
+      <w:proofErr w:type="gramStart"/>
+      <w:r>
+        <w:rPr>
+          <w:rFonts w:cs="Calibri"/>
+          <w:b/>
+          <w:bCs/>
+          <w:color w:val="D86DCB" w:themeColor="accent5" w:themeTint="99"/>
+          <w:sz w:val="32"/>
+          <w:szCs w:val="32"/>
+        </w:rPr>
+        <w:t>5.remainder</w:t>
+      </w:r>
+      <w:proofErr w:type="gramEnd"/>
+      <w:r>
+        <w:rPr>
+          <w:rFonts w:cs="Calibri"/>
+          <w:b/>
+          <w:bCs/>
+          <w:color w:val="D86DCB" w:themeColor="accent5" w:themeTint="99"/>
+          <w:sz w:val="32"/>
+          <w:szCs w:val="32"/>
+        </w:rPr>
+        <w:t>(3)); // 2</w:t>
+      </w:r>
+    </w:p>
+    <w:p>
+      <w:pPr>
+        <w:jc w:val="both"/>
+        <w:rPr>
+          <w:rFonts w:cs="Calibri"/>
+          <w:b/>
+          <w:bCs/>
+          <w:color w:val="D86DCB" w:themeColor="accent5" w:themeTint="99"/>
+          <w:sz w:val="32"/>
+          <w:szCs w:val="32"/>
+        </w:rPr>
+      </w:pPr>
+      <w:r>
+        <w:rPr>
+          <w:rFonts w:cs="Calibri"/>
+          <w:b/>
+          <w:bCs/>
+          <w:color w:val="D86DCB" w:themeColor="accent5" w:themeTint="99"/>
+          <w:sz w:val="32"/>
+          <w:szCs w:val="32"/>
+        </w:rPr>
+        <w:t>print(-</w:t>
+      </w:r>
+      <w:proofErr w:type="gramStart"/>
+      <w:r>
+        <w:rPr>
+          <w:rFonts w:cs="Calibri"/>
+          <w:b/>
+          <w:bCs/>
+          <w:color w:val="D86DCB" w:themeColor="accent5" w:themeTint="99"/>
+          <w:sz w:val="32"/>
+          <w:szCs w:val="32"/>
+        </w:rPr>
+        <w:t>5.remainder</w:t>
+      </w:r>
+      <w:proofErr w:type="gramEnd"/>
+      <w:r>
+        <w:rPr>
+          <w:rFonts w:cs="Calibri"/>
+          <w:b/>
+          <w:bCs/>
+          <w:color w:val="D86DCB" w:themeColor="accent5" w:themeTint="99"/>
+          <w:sz w:val="32"/>
+          <w:szCs w:val="32"/>
+        </w:rPr>
+        <w:t>(3)); // -2</w:t>
+      </w:r>
+    </w:p>
+    <w:p>
+      <w:pPr>
+        <w:jc w:val="both"/>
+        <w:rPr>
+          <w:rFonts w:cs="Calibri"/>
+          <w:b/>
+          <w:bCs/>
+          <w:color w:val="D86DCB" w:themeColor="accent5" w:themeTint="99"/>
+          <w:sz w:val="32"/>
+          <w:szCs w:val="32"/>
+        </w:rPr>
+      </w:pPr>
+      <w:r>
+        <w:rPr>
+          <w:rFonts w:cs="Calibri"/>
+          <w:b/>
+          <w:bCs/>
+          <w:color w:val="D86DCB" w:themeColor="accent5" w:themeTint="99"/>
+          <w:sz w:val="32"/>
+          <w:szCs w:val="32"/>
+        </w:rPr>
+        <w:t>print(</w:t>
+      </w:r>
+      <w:proofErr w:type="gramStart"/>
+      <w:r>
+        <w:rPr>
+          <w:rFonts w:cs="Calibri"/>
+          <w:b/>
+          <w:bCs/>
+          <w:color w:val="D86DCB" w:themeColor="accent5" w:themeTint="99"/>
+          <w:sz w:val="32"/>
+          <w:szCs w:val="32"/>
+        </w:rPr>
+        <w:t>5.remainder</w:t>
+      </w:r>
+      <w:proofErr w:type="gramEnd"/>
+      <w:r>
+        <w:rPr>
+          <w:rFonts w:cs="Calibri"/>
+          <w:b/>
+          <w:bCs/>
+          <w:color w:val="D86DCB" w:themeColor="accent5" w:themeTint="99"/>
+          <w:sz w:val="32"/>
+          <w:szCs w:val="32"/>
+        </w:rPr>
+        <w:t>(-3)); // 2</w:t>
+      </w:r>
+    </w:p>
+    <w:p>
+      <w:pPr>
+        <w:jc w:val="both"/>
+        <w:rPr>
+          <w:rFonts w:cs="Calibri"/>
+          <w:b/>
+          <w:bCs/>
+          <w:color w:val="D86DCB" w:themeColor="accent5" w:themeTint="99"/>
+          <w:sz w:val="32"/>
+          <w:szCs w:val="32"/>
+        </w:rPr>
+      </w:pPr>
+      <w:r>
+        <w:rPr>
+          <w:rFonts w:cs="Calibri"/>
+          <w:b/>
+          <w:bCs/>
+          <w:color w:val="D86DCB" w:themeColor="accent5" w:themeTint="99"/>
+          <w:sz w:val="32"/>
+          <w:szCs w:val="32"/>
+        </w:rPr>
+        <w:t>print(-</w:t>
+      </w:r>
+      <w:proofErr w:type="gramStart"/>
+      <w:r>
+        <w:rPr>
+          <w:rFonts w:cs="Calibri"/>
+          <w:b/>
+          <w:bCs/>
+          <w:color w:val="D86DCB" w:themeColor="accent5" w:themeTint="99"/>
+          <w:sz w:val="32"/>
+          <w:szCs w:val="32"/>
+        </w:rPr>
+        <w:t>5.remainder</w:t>
+      </w:r>
+      <w:proofErr w:type="gramEnd"/>
+      <w:r>
+        <w:rPr>
+          <w:rFonts w:cs="Calibri"/>
+          <w:b/>
+          <w:bCs/>
+          <w:color w:val="D86DCB" w:themeColor="accent5" w:themeTint="99"/>
+          <w:sz w:val="32"/>
+          <w:szCs w:val="32"/>
+        </w:rPr>
+        <w:t>(-3)); // -2</w:t>
+      </w:r>
+    </w:p>
+    <w:p>
+      <w:pPr>
+        <w:jc w:val="both"/>
+        <w:rPr>
+          <w:rFonts w:cs="Calibri"/>
+          <w:sz w:val="32"/>
+          <w:szCs w:val="32"/>
+        </w:rPr>
+      </w:pPr>
+      <w:r>
+        <w:rPr>
+          <w:rFonts w:cs="Calibri"/>
+          <w:b/>
+          <w:bCs/>
+          <w:sz w:val="32"/>
+          <w:szCs w:val="32"/>
+        </w:rPr>
+        <w:t>NOTE:</w:t>
+      </w:r>
+      <w:r>
+        <w:rPr>
+          <w:rFonts w:cs="Calibri"/>
+          <w:sz w:val="32"/>
+          <w:szCs w:val="32"/>
+        </w:rPr>
+        <w:t xml:space="preserve"> See below in </w:t>
+      </w:r>
+      <w:proofErr w:type="gramStart"/>
+      <w:r>
+        <w:rPr>
+          <w:rFonts w:cs="Calibri"/>
+          <w:b/>
+          <w:bCs/>
+          <w:sz w:val="32"/>
+          <w:szCs w:val="32"/>
+        </w:rPr>
+        <w:t>Duration(</w:t>
+      </w:r>
+      <w:proofErr w:type="gramEnd"/>
+      <w:r>
+        <w:rPr>
+          <w:rFonts w:cs="Calibri"/>
+          <w:b/>
+          <w:bCs/>
+          <w:sz w:val="32"/>
+          <w:szCs w:val="32"/>
+        </w:rPr>
+        <w:t xml:space="preserve">) </w:t>
+      </w:r>
+      <w:r>
+        <w:rPr>
+          <w:rFonts w:cs="Calibri"/>
+          <w:sz w:val="32"/>
+          <w:szCs w:val="32"/>
+        </w:rPr>
+        <w:t xml:space="preserve">class for example with duration of </w:t>
+      </w:r>
+      <w:r>
+        <w:rPr>
+          <w:rFonts w:cs="Calibri"/>
+          <w:b/>
+          <w:bCs/>
+          <w:sz w:val="32"/>
+          <w:szCs w:val="32"/>
+        </w:rPr>
+        <w:t xml:space="preserve">.remainder() </w:t>
+      </w:r>
+      <w:r>
+        <w:rPr>
+          <w:rFonts w:cs="Calibri"/>
+          <w:sz w:val="32"/>
+          <w:szCs w:val="32"/>
+        </w:rPr>
+        <w:t>method</w:t>
+      </w:r>
+    </w:p>
+    <w:p>
+      <w:pPr>
+        <w:jc w:val="both"/>
+        <w:rPr>
+          <w:rFonts w:cs="Calibri"/>
+          <w:sz w:val="32"/>
+          <w:szCs w:val="32"/>
+        </w:rPr>
+      </w:pPr>
+    </w:p>
+    <w:p>
+      <w:pPr>
+        <w:jc w:val="center"/>
+        <w:rPr>
+          <w:rFonts w:cs="Calibri"/>
+          <w:sz w:val="32"/>
+          <w:szCs w:val="32"/>
+        </w:rPr>
+      </w:pPr>
+      <w:r>
+        <w:rPr>
+          <w:rFonts w:cs="Calibri"/>
+          <w:sz w:val="32"/>
+          <w:szCs w:val="32"/>
+        </w:rPr>
+        <w:t>Break</w:t>
+      </w:r>
+    </w:p>
+    <w:p>
+      <w:pPr>
+        <w:jc w:val="both"/>
+        <w:rPr>
+          <w:rFonts w:cs="Calibri"/>
+          <w:b/>
+          <w:bCs/>
+          <w:sz w:val="32"/>
+          <w:szCs w:val="32"/>
+        </w:rPr>
+      </w:pPr>
+    </w:p>
+    <w:p>
+      <w:pPr>
+        <w:jc w:val="both"/>
+        <w:rPr>
+          <w:rFonts w:cs="Calibri"/>
+          <w:sz w:val="32"/>
+          <w:szCs w:val="32"/>
+        </w:rPr>
+      </w:pPr>
+      <w:r>
+        <w:rPr>
+          <w:rFonts w:cs="Calibri"/>
+          <w:b/>
+          <w:bCs/>
+          <w:sz w:val="32"/>
+          <w:szCs w:val="32"/>
+        </w:rPr>
+        <w:t>.</w:t>
+      </w:r>
+      <w:proofErr w:type="gramStart"/>
+      <w:r>
+        <w:rPr>
+          <w:rFonts w:cs="Calibri"/>
+          <w:b/>
+          <w:bCs/>
+          <w:sz w:val="32"/>
+          <w:szCs w:val="32"/>
+        </w:rPr>
+        <w:t>max(</w:t>
+      </w:r>
+      <w:proofErr w:type="gramEnd"/>
+      <w:r>
+        <w:rPr>
+          <w:rFonts w:cs="Calibri"/>
+          <w:b/>
+          <w:bCs/>
+          <w:sz w:val="32"/>
+          <w:szCs w:val="32"/>
+        </w:rPr>
+        <w:t xml:space="preserve">) </w:t>
       </w:r>
       <w:r>
         <w:rPr>
@@ -7401,24 +6987,34 @@
           <w:szCs w:val="32"/>
         </w:rPr>
       </w:pPr>
+      <w:r>
+        <w:rPr>
+          <w:rFonts w:cs="Calibri"/>
+          <w:sz w:val="32"/>
+          <w:szCs w:val="32"/>
+        </w:rPr>
+        <w:t xml:space="preserve"># </w:t>
+      </w:r>
+      <w:r>
+        <w:rPr>
+          <w:rFonts w:cs="Calibri"/>
+          <w:b/>
+          <w:bCs/>
+          <w:sz w:val="32"/>
+          <w:szCs w:val="32"/>
+        </w:rPr>
+        <w:t>.</w:t>
+      </w:r>
       <w:proofErr w:type="gramStart"/>
       <w:r>
         <w:rPr>
           <w:rFonts w:cs="Calibri"/>
-          <w:sz w:val="32"/>
-          <w:szCs w:val="32"/>
-        </w:rPr>
-        <w:t xml:space="preserve"># </w:t>
-      </w:r>
-      <w:r>
-        <w:rPr>
-          <w:rFonts w:cs="Calibri"/>
-          <w:b/>
-          <w:bCs/>
-          <w:sz w:val="32"/>
-          <w:szCs w:val="32"/>
-        </w:rPr>
-        <w:t>.remainder</w:t>
+          <w:b/>
+          <w:bCs/>
+          <w:sz w:val="32"/>
+          <w:szCs w:val="32"/>
+        </w:rPr>
+        <w:t>max(</w:t>
       </w:r>
       <w:proofErr w:type="gramEnd"/>
       <w:r>
@@ -7429,480 +7025,6 @@
           <w:sz w:val="32"/>
           <w:szCs w:val="32"/>
         </w:rPr>
-        <w:t>()</w:t>
-      </w:r>
-      <w:r>
-        <w:rPr>
-          <w:rFonts w:cs="Calibri"/>
-          <w:sz w:val="32"/>
-          <w:szCs w:val="32"/>
-        </w:rPr>
-        <w:t xml:space="preserve"> method gives us a number, after taking (specified in the parameter) whatever is LEFT. Especially useful with </w:t>
-      </w:r>
-      <w:proofErr w:type="gramStart"/>
-      <w:r>
-        <w:rPr>
-          <w:rFonts w:cs="Calibri"/>
-          <w:b/>
-          <w:bCs/>
-          <w:sz w:val="32"/>
-          <w:szCs w:val="32"/>
-        </w:rPr>
-        <w:t>Duration(</w:t>
-      </w:r>
-      <w:proofErr w:type="gramEnd"/>
-      <w:r>
-        <w:rPr>
-          <w:rFonts w:cs="Calibri"/>
-          <w:b/>
-          <w:bCs/>
-          <w:sz w:val="32"/>
-          <w:szCs w:val="32"/>
-        </w:rPr>
-        <w:t>)</w:t>
-      </w:r>
-      <w:r>
-        <w:rPr>
-          <w:rFonts w:cs="Calibri"/>
-          <w:sz w:val="32"/>
-          <w:szCs w:val="32"/>
-        </w:rPr>
-        <w:t xml:space="preserve"> class we can take whatever seconds are LEFT after taking minutes. </w:t>
-      </w:r>
-      <w:proofErr w:type="gramStart"/>
-      <w:r>
-        <w:rPr>
-          <w:rFonts w:cs="Calibri"/>
-          <w:sz w:val="32"/>
-          <w:szCs w:val="32"/>
-        </w:rPr>
-        <w:t xml:space="preserve">Like </w:t>
-      </w:r>
-      <w:r>
-        <w:rPr>
-          <w:rFonts w:cs="Calibri"/>
-          <w:b/>
-          <w:bCs/>
-          <w:sz w:val="32"/>
-          <w:szCs w:val="32"/>
-        </w:rPr>
-        <w:t>.remainder</w:t>
-      </w:r>
-      <w:proofErr w:type="gramEnd"/>
-      <w:r>
-        <w:rPr>
-          <w:rFonts w:cs="Calibri"/>
-          <w:b/>
-          <w:bCs/>
-          <w:sz w:val="32"/>
-          <w:szCs w:val="32"/>
-        </w:rPr>
-        <w:t>(60)</w:t>
-      </w:r>
-      <w:r>
-        <w:rPr>
-          <w:rFonts w:cs="Calibri"/>
-          <w:sz w:val="32"/>
-          <w:szCs w:val="32"/>
-        </w:rPr>
-        <w:t>, example:</w:t>
-      </w:r>
-    </w:p>
-    <w:p>
-      <w:pPr>
-        <w:jc w:val="both"/>
-        <w:rPr>
-          <w:rFonts w:cs="Calibri"/>
-          <w:b/>
-          <w:bCs/>
-          <w:sz w:val="32"/>
-          <w:szCs w:val="32"/>
-        </w:rPr>
-      </w:pPr>
-      <w:r>
-        <w:rPr>
-          <w:rFonts w:cs="Calibri"/>
-          <w:b/>
-          <w:bCs/>
-          <w:sz w:val="32"/>
-          <w:szCs w:val="32"/>
-        </w:rPr>
-        <w:t>140 % 60 = 20</w:t>
-      </w:r>
-    </w:p>
-    <w:p>
-      <w:pPr>
-        <w:jc w:val="both"/>
-        <w:rPr>
-          <w:rFonts w:cs="Calibri"/>
-          <w:sz w:val="32"/>
-          <w:szCs w:val="32"/>
-        </w:rPr>
-      </w:pPr>
-      <w:r>
-        <w:rPr>
-          <w:rFonts w:cs="Calibri"/>
-          <w:sz w:val="32"/>
-          <w:szCs w:val="32"/>
-        </w:rPr>
-        <w:t xml:space="preserve"># So, after taking 60 two times or minutes 20 seconds are left and that is returned. But IN REALITY, it follows this, the remainder of the truncating division of </w:t>
-      </w:r>
-      <w:r>
-        <w:rPr>
-          <w:rFonts w:cs="Calibri"/>
-          <w:b/>
-          <w:bCs/>
-          <w:sz w:val="32"/>
-          <w:szCs w:val="32"/>
-        </w:rPr>
-        <w:t>this</w:t>
-      </w:r>
-      <w:r>
-        <w:rPr>
-          <w:rFonts w:cs="Calibri"/>
-          <w:sz w:val="32"/>
-          <w:szCs w:val="32"/>
-        </w:rPr>
-        <w:t xml:space="preserve"> by </w:t>
-      </w:r>
-      <w:r>
-        <w:rPr>
-          <w:rFonts w:cs="Calibri"/>
-          <w:b/>
-          <w:bCs/>
-          <w:sz w:val="32"/>
-          <w:szCs w:val="32"/>
-        </w:rPr>
-        <w:t>other</w:t>
-      </w:r>
-      <w:r>
-        <w:rPr>
-          <w:rFonts w:cs="Calibri"/>
-          <w:sz w:val="32"/>
-          <w:szCs w:val="32"/>
-        </w:rPr>
-        <w:t xml:space="preserve">. The result </w:t>
-      </w:r>
-      <w:r>
-        <w:rPr>
-          <w:rFonts w:cs="Calibri"/>
-          <w:b/>
-          <w:bCs/>
-          <w:sz w:val="32"/>
-          <w:szCs w:val="32"/>
-        </w:rPr>
-        <w:t>r</w:t>
-      </w:r>
-      <w:r>
-        <w:rPr>
-          <w:rFonts w:cs="Calibri"/>
-          <w:sz w:val="32"/>
-          <w:szCs w:val="32"/>
-        </w:rPr>
-        <w:t xml:space="preserve"> of this method satisfies:</w:t>
-      </w:r>
-    </w:p>
-    <w:p>
-      <w:pPr>
-        <w:jc w:val="both"/>
-        <w:rPr>
-          <w:rFonts w:cs="Calibri"/>
-          <w:b/>
-          <w:bCs/>
-          <w:sz w:val="32"/>
-          <w:szCs w:val="32"/>
-        </w:rPr>
-      </w:pPr>
-      <w:r>
-        <w:rPr>
-          <w:rFonts w:cs="Calibri"/>
-          <w:b/>
-          <w:bCs/>
-          <w:sz w:val="32"/>
-          <w:szCs w:val="32"/>
-        </w:rPr>
-        <w:t>this == (this ~/ other) * other + r</w:t>
-      </w:r>
-    </w:p>
-    <w:p>
-      <w:pPr>
-        <w:jc w:val="both"/>
-        <w:rPr>
-          <w:rFonts w:cs="Calibri"/>
-          <w:b/>
-          <w:bCs/>
-          <w:sz w:val="32"/>
-          <w:szCs w:val="32"/>
-        </w:rPr>
-      </w:pPr>
-      <w:r>
-        <w:rPr>
-          <w:rFonts w:cs="Calibri"/>
-          <w:b/>
-          <w:bCs/>
-          <w:sz w:val="32"/>
-          <w:szCs w:val="32"/>
-        </w:rPr>
-        <w:t>140 == (140 ~/ 60) * 60 + 20</w:t>
-      </w:r>
-    </w:p>
-    <w:p>
-      <w:pPr>
-        <w:jc w:val="both"/>
-        <w:rPr>
-          <w:rFonts w:cs="Calibri"/>
-          <w:sz w:val="32"/>
-          <w:szCs w:val="32"/>
-        </w:rPr>
-      </w:pPr>
-      <w:r>
-        <w:rPr>
-          <w:rFonts w:cs="Calibri"/>
-          <w:sz w:val="32"/>
-          <w:szCs w:val="32"/>
-        </w:rPr>
-        <w:t># Code</w:t>
-      </w:r>
-    </w:p>
-    <w:p>
-      <w:pPr>
-        <w:jc w:val="both"/>
-        <w:rPr>
-          <w:rFonts w:cs="Calibri"/>
-          <w:b/>
-          <w:bCs/>
-          <w:color w:val="D86DCB" w:themeColor="accent5" w:themeTint="99"/>
-          <w:sz w:val="32"/>
-          <w:szCs w:val="32"/>
-        </w:rPr>
-      </w:pPr>
-      <w:r>
-        <w:rPr>
-          <w:rFonts w:cs="Calibri"/>
-          <w:b/>
-          <w:bCs/>
-          <w:color w:val="D86DCB" w:themeColor="accent5" w:themeTint="99"/>
-          <w:sz w:val="32"/>
-          <w:szCs w:val="32"/>
-        </w:rPr>
-        <w:t>print(</w:t>
-      </w:r>
-      <w:proofErr w:type="gramStart"/>
-      <w:r>
-        <w:rPr>
-          <w:rFonts w:cs="Calibri"/>
-          <w:b/>
-          <w:bCs/>
-          <w:color w:val="D86DCB" w:themeColor="accent5" w:themeTint="99"/>
-          <w:sz w:val="32"/>
-          <w:szCs w:val="32"/>
-        </w:rPr>
-        <w:t>5.remainder</w:t>
-      </w:r>
-      <w:proofErr w:type="gramEnd"/>
-      <w:r>
-        <w:rPr>
-          <w:rFonts w:cs="Calibri"/>
-          <w:b/>
-          <w:bCs/>
-          <w:color w:val="D86DCB" w:themeColor="accent5" w:themeTint="99"/>
-          <w:sz w:val="32"/>
-          <w:szCs w:val="32"/>
-        </w:rPr>
-        <w:t>(3)); // 2</w:t>
-      </w:r>
-    </w:p>
-    <w:p>
-      <w:pPr>
-        <w:jc w:val="both"/>
-        <w:rPr>
-          <w:rFonts w:cs="Calibri"/>
-          <w:b/>
-          <w:bCs/>
-          <w:color w:val="D86DCB" w:themeColor="accent5" w:themeTint="99"/>
-          <w:sz w:val="32"/>
-          <w:szCs w:val="32"/>
-        </w:rPr>
-      </w:pPr>
-      <w:r>
-        <w:rPr>
-          <w:rFonts w:cs="Calibri"/>
-          <w:b/>
-          <w:bCs/>
-          <w:color w:val="D86DCB" w:themeColor="accent5" w:themeTint="99"/>
-          <w:sz w:val="32"/>
-          <w:szCs w:val="32"/>
-        </w:rPr>
-        <w:t>print(-</w:t>
-      </w:r>
-      <w:proofErr w:type="gramStart"/>
-      <w:r>
-        <w:rPr>
-          <w:rFonts w:cs="Calibri"/>
-          <w:b/>
-          <w:bCs/>
-          <w:color w:val="D86DCB" w:themeColor="accent5" w:themeTint="99"/>
-          <w:sz w:val="32"/>
-          <w:szCs w:val="32"/>
-        </w:rPr>
-        <w:t>5.remainder</w:t>
-      </w:r>
-      <w:proofErr w:type="gramEnd"/>
-      <w:r>
-        <w:rPr>
-          <w:rFonts w:cs="Calibri"/>
-          <w:b/>
-          <w:bCs/>
-          <w:color w:val="D86DCB" w:themeColor="accent5" w:themeTint="99"/>
-          <w:sz w:val="32"/>
-          <w:szCs w:val="32"/>
-        </w:rPr>
-        <w:t>(3)); // -2</w:t>
-      </w:r>
-    </w:p>
-    <w:p>
-      <w:pPr>
-        <w:jc w:val="both"/>
-        <w:rPr>
-          <w:rFonts w:cs="Calibri"/>
-          <w:b/>
-          <w:bCs/>
-          <w:color w:val="D86DCB" w:themeColor="accent5" w:themeTint="99"/>
-          <w:sz w:val="32"/>
-          <w:szCs w:val="32"/>
-        </w:rPr>
-      </w:pPr>
-      <w:r>
-        <w:rPr>
-          <w:rFonts w:cs="Calibri"/>
-          <w:b/>
-          <w:bCs/>
-          <w:color w:val="D86DCB" w:themeColor="accent5" w:themeTint="99"/>
-          <w:sz w:val="32"/>
-          <w:szCs w:val="32"/>
-        </w:rPr>
-        <w:t>print(</w:t>
-      </w:r>
-      <w:proofErr w:type="gramStart"/>
-      <w:r>
-        <w:rPr>
-          <w:rFonts w:cs="Calibri"/>
-          <w:b/>
-          <w:bCs/>
-          <w:color w:val="D86DCB" w:themeColor="accent5" w:themeTint="99"/>
-          <w:sz w:val="32"/>
-          <w:szCs w:val="32"/>
-        </w:rPr>
-        <w:t>5.remainder</w:t>
-      </w:r>
-      <w:proofErr w:type="gramEnd"/>
-      <w:r>
-        <w:rPr>
-          <w:rFonts w:cs="Calibri"/>
-          <w:b/>
-          <w:bCs/>
-          <w:color w:val="D86DCB" w:themeColor="accent5" w:themeTint="99"/>
-          <w:sz w:val="32"/>
-          <w:szCs w:val="32"/>
-        </w:rPr>
-        <w:t>(-3)); // 2</w:t>
-      </w:r>
-    </w:p>
-    <w:p>
-      <w:pPr>
-        <w:jc w:val="both"/>
-        <w:rPr>
-          <w:rFonts w:cs="Calibri"/>
-          <w:b/>
-          <w:bCs/>
-          <w:color w:val="D86DCB" w:themeColor="accent5" w:themeTint="99"/>
-          <w:sz w:val="32"/>
-          <w:szCs w:val="32"/>
-        </w:rPr>
-      </w:pPr>
-      <w:r>
-        <w:rPr>
-          <w:rFonts w:cs="Calibri"/>
-          <w:b/>
-          <w:bCs/>
-          <w:color w:val="D86DCB" w:themeColor="accent5" w:themeTint="99"/>
-          <w:sz w:val="32"/>
-          <w:szCs w:val="32"/>
-        </w:rPr>
-        <w:t>print(-</w:t>
-      </w:r>
-      <w:proofErr w:type="gramStart"/>
-      <w:r>
-        <w:rPr>
-          <w:rFonts w:cs="Calibri"/>
-          <w:b/>
-          <w:bCs/>
-          <w:color w:val="D86DCB" w:themeColor="accent5" w:themeTint="99"/>
-          <w:sz w:val="32"/>
-          <w:szCs w:val="32"/>
-        </w:rPr>
-        <w:t>5.remainder</w:t>
-      </w:r>
-      <w:proofErr w:type="gramEnd"/>
-      <w:r>
-        <w:rPr>
-          <w:rFonts w:cs="Calibri"/>
-          <w:b/>
-          <w:bCs/>
-          <w:color w:val="D86DCB" w:themeColor="accent5" w:themeTint="99"/>
-          <w:sz w:val="32"/>
-          <w:szCs w:val="32"/>
-        </w:rPr>
-        <w:t>(-3)); // -2</w:t>
-      </w:r>
-    </w:p>
-    <w:p>
-      <w:pPr>
-        <w:jc w:val="both"/>
-        <w:rPr>
-          <w:rFonts w:cs="Calibri"/>
-          <w:sz w:val="32"/>
-          <w:szCs w:val="32"/>
-        </w:rPr>
-      </w:pPr>
-      <w:r>
-        <w:rPr>
-          <w:rFonts w:cs="Calibri"/>
-          <w:b/>
-          <w:bCs/>
-          <w:sz w:val="32"/>
-          <w:szCs w:val="32"/>
-        </w:rPr>
-        <w:t>NOTE:</w:t>
-      </w:r>
-      <w:r>
-        <w:rPr>
-          <w:rFonts w:cs="Calibri"/>
-          <w:sz w:val="32"/>
-          <w:szCs w:val="32"/>
-        </w:rPr>
-        <w:t xml:space="preserve"> See below in </w:t>
-      </w:r>
-      <w:proofErr w:type="gramStart"/>
-      <w:r>
-        <w:rPr>
-          <w:rFonts w:cs="Calibri"/>
-          <w:b/>
-          <w:bCs/>
-          <w:sz w:val="32"/>
-          <w:szCs w:val="32"/>
-        </w:rPr>
-        <w:t>Duration(</w:t>
-      </w:r>
-      <w:proofErr w:type="gramEnd"/>
-      <w:r>
-        <w:rPr>
-          <w:rFonts w:cs="Calibri"/>
-          <w:b/>
-          <w:bCs/>
-          <w:sz w:val="32"/>
-          <w:szCs w:val="32"/>
-        </w:rPr>
         <w:t xml:space="preserve">) </w:t>
       </w:r>
       <w:r>
@@ -7911,184 +7033,6 @@
           <w:sz w:val="32"/>
           <w:szCs w:val="32"/>
         </w:rPr>
-        <w:t xml:space="preserve">class for example with duration of </w:t>
-      </w:r>
-      <w:r>
-        <w:rPr>
-          <w:rFonts w:cs="Calibri"/>
-          <w:b/>
-          <w:bCs/>
-          <w:sz w:val="32"/>
-          <w:szCs w:val="32"/>
-        </w:rPr>
-        <w:t xml:space="preserve">.remainder() </w:t>
-      </w:r>
-      <w:r>
-        <w:rPr>
-          <w:rFonts w:cs="Calibri"/>
-          <w:sz w:val="32"/>
-          <w:szCs w:val="32"/>
-        </w:rPr>
-        <w:t>method</w:t>
-      </w:r>
-    </w:p>
-    <w:p>
-      <w:pPr>
-        <w:jc w:val="both"/>
-        <w:rPr>
-          <w:rFonts w:cs="Calibri"/>
-          <w:sz w:val="32"/>
-          <w:szCs w:val="32"/>
-        </w:rPr>
-      </w:pPr>
-    </w:p>
-    <w:p>
-      <w:pPr>
-        <w:jc w:val="center"/>
-        <w:rPr>
-          <w:rFonts w:cs="Calibri"/>
-          <w:sz w:val="32"/>
-          <w:szCs w:val="32"/>
-        </w:rPr>
-      </w:pPr>
-      <w:r>
-        <w:rPr>
-          <w:rFonts w:cs="Calibri"/>
-          <w:sz w:val="32"/>
-          <w:szCs w:val="32"/>
-        </w:rPr>
-        <w:t>Break</w:t>
-      </w:r>
-    </w:p>
-    <w:p>
-      <w:pPr>
-        <w:jc w:val="both"/>
-        <w:rPr>
-          <w:rFonts w:cs="Calibri"/>
-          <w:b/>
-          <w:bCs/>
-          <w:sz w:val="32"/>
-          <w:szCs w:val="32"/>
-        </w:rPr>
-      </w:pPr>
-    </w:p>
-    <w:p>
-      <w:pPr>
-        <w:jc w:val="both"/>
-        <w:rPr>
-          <w:rFonts w:cs="Calibri"/>
-          <w:sz w:val="32"/>
-          <w:szCs w:val="32"/>
-        </w:rPr>
-      </w:pPr>
-      <w:r>
-        <w:rPr>
-          <w:rFonts w:cs="Calibri"/>
-          <w:b/>
-          <w:bCs/>
-          <w:sz w:val="32"/>
-          <w:szCs w:val="32"/>
-        </w:rPr>
-        <w:t>.</w:t>
-      </w:r>
-      <w:proofErr w:type="gramStart"/>
-      <w:r>
-        <w:rPr>
-          <w:rFonts w:cs="Calibri"/>
-          <w:b/>
-          <w:bCs/>
-          <w:sz w:val="32"/>
-          <w:szCs w:val="32"/>
-        </w:rPr>
-        <w:t>max(</w:t>
-      </w:r>
-      <w:proofErr w:type="gramEnd"/>
-      <w:r>
-        <w:rPr>
-          <w:rFonts w:cs="Calibri"/>
-          <w:b/>
-          <w:bCs/>
-          <w:sz w:val="32"/>
-          <w:szCs w:val="32"/>
-        </w:rPr>
-        <w:t xml:space="preserve">) </w:t>
-      </w:r>
-      <w:r>
-        <w:rPr>
-          <w:rFonts w:cs="Calibri"/>
-          <w:b/>
-          <w:bCs/>
-          <w:sz w:val="32"/>
-          <w:szCs w:val="32"/>
-        </w:rPr>
-        <w:t>M</w:t>
-      </w:r>
-      <w:r>
-        <w:rPr>
-          <w:rFonts w:cs="Calibri"/>
-          <w:b/>
-          <w:bCs/>
-          <w:sz w:val="32"/>
-          <w:szCs w:val="32"/>
-        </w:rPr>
-        <w:t>ethod:</w:t>
-      </w:r>
-    </w:p>
-    <w:p>
-      <w:pPr>
-        <w:jc w:val="both"/>
-        <w:rPr>
-          <w:rFonts w:cs="Calibri"/>
-          <w:sz w:val="32"/>
-          <w:szCs w:val="32"/>
-        </w:rPr>
-      </w:pPr>
-      <w:r>
-        <w:rPr>
-          <w:rFonts w:cs="Calibri"/>
-          <w:sz w:val="32"/>
-          <w:szCs w:val="32"/>
-        </w:rPr>
-        <w:t xml:space="preserve"># </w:t>
-      </w:r>
-      <w:r>
-        <w:rPr>
-          <w:rFonts w:cs="Calibri"/>
-          <w:b/>
-          <w:bCs/>
-          <w:sz w:val="32"/>
-          <w:szCs w:val="32"/>
-        </w:rPr>
-        <w:t>.</w:t>
-      </w:r>
-      <w:proofErr w:type="gramStart"/>
-      <w:r>
-        <w:rPr>
-          <w:rFonts w:cs="Calibri"/>
-          <w:b/>
-          <w:bCs/>
-          <w:sz w:val="32"/>
-          <w:szCs w:val="32"/>
-        </w:rPr>
-        <w:t>max(</w:t>
-      </w:r>
-      <w:proofErr w:type="gramEnd"/>
-      <w:r>
-        <w:rPr>
-          <w:rFonts w:cs="Calibri"/>
-          <w:b/>
-          <w:bCs/>
-          <w:sz w:val="32"/>
-          <w:szCs w:val="32"/>
-        </w:rPr>
-        <w:t xml:space="preserve">) </w:t>
-      </w:r>
-      <w:r>
-        <w:rPr>
-          <w:rFonts w:cs="Calibri"/>
-          <w:sz w:val="32"/>
-          <w:szCs w:val="32"/>
-        </w:rPr>
         <w:t xml:space="preserve">comes from </w:t>
       </w:r>
       <w:r>
@@ -8131,7 +7075,6 @@
           <w:sz w:val="32"/>
           <w:szCs w:val="32"/>
         </w:rPr>
-        <w:lastRenderedPageBreak/>
         <w:t>import '</w:t>
       </w:r>
       <w:proofErr w:type="spellStart"/>
@@ -8176,6 +7119,7 @@
           <w:sz w:val="32"/>
           <w:szCs w:val="32"/>
         </w:rPr>
+        <w:lastRenderedPageBreak/>
         <w:t xml:space="preserve"># </w:t>
       </w:r>
       <w:r>
@@ -9057,31 +8001,31 @@
           <w:sz w:val="32"/>
           <w:szCs w:val="32"/>
         </w:rPr>
+        <w:t xml:space="preserve">  min: 0,</w:t>
+      </w:r>
+    </w:p>
+    <w:p>
+      <w:pPr>
+        <w:jc w:val="both"/>
+        <w:rPr>
+          <w:rFonts w:cs="Calibri"/>
+          <w:b/>
+          <w:bCs/>
+          <w:color w:val="D86DCB" w:themeColor="accent5" w:themeTint="99"/>
+          <w:sz w:val="32"/>
+          <w:szCs w:val="32"/>
+        </w:rPr>
+      </w:pPr>
+      <w:r>
+        <w:rPr>
+          <w:rFonts w:cs="Calibri"/>
+          <w:b/>
+          <w:bCs/>
+          <w:color w:val="D86DCB" w:themeColor="accent5" w:themeTint="99"/>
+          <w:sz w:val="32"/>
+          <w:szCs w:val="32"/>
+        </w:rPr>
         <w:lastRenderedPageBreak/>
-        <w:t xml:space="preserve">  min: 0,</w:t>
-      </w:r>
-    </w:p>
-    <w:p>
-      <w:pPr>
-        <w:jc w:val="both"/>
-        <w:rPr>
-          <w:rFonts w:cs="Calibri"/>
-          <w:b/>
-          <w:bCs/>
-          <w:color w:val="D86DCB" w:themeColor="accent5" w:themeTint="99"/>
-          <w:sz w:val="32"/>
-          <w:szCs w:val="32"/>
-        </w:rPr>
-      </w:pPr>
-      <w:r>
-        <w:rPr>
-          <w:rFonts w:cs="Calibri"/>
-          <w:b/>
-          <w:bCs/>
-          <w:color w:val="D86DCB" w:themeColor="accent5" w:themeTint="99"/>
-          <w:sz w:val="32"/>
-          <w:szCs w:val="32"/>
-        </w:rPr>
         <w:t xml:space="preserve">  max: max(</w:t>
       </w:r>
       <w:proofErr w:type="spellStart"/>
@@ -9972,31 +8916,31 @@
           <w:sz w:val="32"/>
           <w:szCs w:val="32"/>
         </w:rPr>
+        <w:t xml:space="preserve">        )!,</w:t>
+      </w:r>
+    </w:p>
+    <w:p>
+      <w:pPr>
+        <w:jc w:val="both"/>
+        <w:rPr>
+          <w:rFonts w:cs="Calibri"/>
+          <w:b/>
+          <w:bCs/>
+          <w:color w:val="D86DCB" w:themeColor="accent5" w:themeTint="99"/>
+          <w:sz w:val="32"/>
+          <w:szCs w:val="32"/>
+        </w:rPr>
+      </w:pPr>
+      <w:r>
+        <w:rPr>
+          <w:rFonts w:cs="Calibri"/>
+          <w:b/>
+          <w:bCs/>
+          <w:color w:val="D86DCB" w:themeColor="accent5" w:themeTint="99"/>
+          <w:sz w:val="32"/>
+          <w:szCs w:val="32"/>
+        </w:rPr>
         <w:lastRenderedPageBreak/>
-        <w:t xml:space="preserve">        )!,</w:t>
-      </w:r>
-    </w:p>
-    <w:p>
-      <w:pPr>
-        <w:jc w:val="both"/>
-        <w:rPr>
-          <w:rFonts w:cs="Calibri"/>
-          <w:b/>
-          <w:bCs/>
-          <w:color w:val="D86DCB" w:themeColor="accent5" w:themeTint="99"/>
-          <w:sz w:val="32"/>
-          <w:szCs w:val="32"/>
-        </w:rPr>
-      </w:pPr>
-      <w:r>
-        <w:rPr>
-          <w:rFonts w:cs="Calibri"/>
-          <w:b/>
-          <w:bCs/>
-          <w:color w:val="D86DCB" w:themeColor="accent5" w:themeTint="99"/>
-          <w:sz w:val="32"/>
-          <w:szCs w:val="32"/>
-        </w:rPr>
         <w:t xml:space="preserve">        child: </w:t>
       </w:r>
       <w:proofErr w:type="gramStart"/>
@@ -10934,7 +9878,6 @@
           <w:sz w:val="32"/>
           <w:szCs w:val="32"/>
         </w:rPr>
-        <w:lastRenderedPageBreak/>
         <w:t xml:space="preserve"># Suppose, </w:t>
       </w:r>
       <w:r>
@@ -10996,6 +9939,7 @@
           <w:sz w:val="32"/>
           <w:szCs w:val="32"/>
         </w:rPr>
+        <w:lastRenderedPageBreak/>
         <w:t xml:space="preserve">system.name == "dark" </w:t>
       </w:r>
       <w:r>
@@ -12482,31 +11426,31 @@
           <w:sz w:val="32"/>
           <w:szCs w:val="32"/>
         </w:rPr>
+        <w:t xml:space="preserve">  3,</w:t>
+      </w:r>
+    </w:p>
+    <w:p>
+      <w:pPr>
+        <w:jc w:val="both"/>
+        <w:rPr>
+          <w:rFonts w:cs="Calibri"/>
+          <w:b/>
+          <w:bCs/>
+          <w:color w:val="D86DCB" w:themeColor="accent5" w:themeTint="99"/>
+          <w:sz w:val="32"/>
+          <w:szCs w:val="32"/>
+        </w:rPr>
+      </w:pPr>
+      <w:r>
+        <w:rPr>
+          <w:rFonts w:cs="Calibri"/>
+          <w:b/>
+          <w:bCs/>
+          <w:color w:val="D86DCB" w:themeColor="accent5" w:themeTint="99"/>
+          <w:sz w:val="32"/>
+          <w:szCs w:val="32"/>
+        </w:rPr>
         <w:lastRenderedPageBreak/>
-        <w:t xml:space="preserve">  3,</w:t>
-      </w:r>
-    </w:p>
-    <w:p>
-      <w:pPr>
-        <w:jc w:val="both"/>
-        <w:rPr>
-          <w:rFonts w:cs="Calibri"/>
-          <w:b/>
-          <w:bCs/>
-          <w:color w:val="D86DCB" w:themeColor="accent5" w:themeTint="99"/>
-          <w:sz w:val="32"/>
-          <w:szCs w:val="32"/>
-        </w:rPr>
-      </w:pPr>
-      <w:r>
-        <w:rPr>
-          <w:rFonts w:cs="Calibri"/>
-          <w:b/>
-          <w:bCs/>
-          <w:color w:val="D86DCB" w:themeColor="accent5" w:themeTint="99"/>
-          <w:sz w:val="32"/>
-          <w:szCs w:val="32"/>
-        </w:rPr>
         <w:t xml:space="preserve">  (_) =&gt; </w:t>
       </w:r>
       <w:proofErr w:type="spellStart"/>
@@ -27397,7 +26341,23 @@
           <w:sz w:val="32"/>
           <w:szCs w:val="32"/>
         </w:rPr>
-        <w:t xml:space="preserve"># If we have a time stamp ("dt": 1731079200), we can convert it in a readable time using </w:t>
+        <w:t># If we have a time stamp ("dt": 1731079200), we can convert it in a</w:t>
+      </w:r>
+      <w:r>
+        <w:rPr>
+          <w:rFonts w:cs="Calibri"/>
+          <w:sz w:val="32"/>
+          <w:szCs w:val="32"/>
+        </w:rPr>
+        <w:t xml:space="preserve"> </w:t>
+      </w:r>
+      <w:r>
+        <w:rPr>
+          <w:rFonts w:cs="Calibri"/>
+          <w:sz w:val="32"/>
+          <w:szCs w:val="32"/>
+        </w:rPr>
+        <w:t xml:space="preserve">readable time using </w:t>
       </w:r>
       <w:proofErr w:type="spellStart"/>
       <w:r>
@@ -29453,6 +28413,35 @@
           <w:szCs w:val="32"/>
         </w:rPr>
         <w:t>8601String());</w:t>
+      </w:r>
+    </w:p>
+    <w:p>
+      <w:pPr>
+        <w:jc w:val="both"/>
+        <w:rPr>
+          <w:rFonts w:cs="Calibri"/>
+          <w:sz w:val="32"/>
+          <w:szCs w:val="32"/>
+        </w:rPr>
+      </w:pPr>
+      <w:r>
+        <w:rPr>
+          <w:rFonts w:cs="Calibri"/>
+          <w:b/>
+          <w:bCs/>
+          <w:sz w:val="32"/>
+          <w:szCs w:val="32"/>
+        </w:rPr>
+        <w:lastRenderedPageBreak/>
+        <w:t>NOTE:</w:t>
+      </w:r>
+      <w:r>
+        <w:rPr>
+          <w:rFonts w:cs="Calibri"/>
+          <w:sz w:val="32"/>
+          <w:szCs w:val="32"/>
+        </w:rPr>
+        <w:t xml:space="preserve"> For more practical code usage see the IntelliJ IDE codes</w:t>
       </w:r>
     </w:p>
     <w:p>
@@ -30118,6 +29107,7 @@
           <w:sz w:val="32"/>
           <w:szCs w:val="32"/>
         </w:rPr>
+        <w:lastRenderedPageBreak/>
         <w:t># Then we define the extra method (</w:t>
       </w:r>
       <w:proofErr w:type="gramStart"/>
@@ -30192,7 +29182,6 @@
           <w:sz w:val="32"/>
           <w:szCs w:val="32"/>
         </w:rPr>
-        <w:lastRenderedPageBreak/>
         <w:t xml:space="preserve"># Even though String never had a </w:t>
       </w:r>
       <w:proofErr w:type="gramStart"/>
@@ -31258,6 +30247,7 @@
           <w:sz w:val="32"/>
           <w:szCs w:val="32"/>
         </w:rPr>
+        <w:lastRenderedPageBreak/>
         <w:t># I</w:t>
       </w:r>
       <w:r>
@@ -31289,7 +30279,6 @@
           <w:sz w:val="32"/>
           <w:szCs w:val="32"/>
         </w:rPr>
-        <w:lastRenderedPageBreak/>
         <w:t>AppLocalizations.of</w:t>
       </w:r>
       <w:proofErr w:type="spellEnd"/>
@@ -32213,6 +31202,7 @@
           <w:sz w:val="32"/>
           <w:szCs w:val="32"/>
         </w:rPr>
+        <w:lastRenderedPageBreak/>
         <w:t xml:space="preserve"># </w:t>
       </w:r>
       <w:r>
@@ -32244,7 +31234,6 @@
           <w:sz w:val="32"/>
           <w:szCs w:val="32"/>
         </w:rPr>
-        <w:lastRenderedPageBreak/>
         <w:t>Text(</w:t>
       </w:r>
       <w:proofErr w:type="gramStart"/>
@@ -32850,6 +31839,7 @@
           <w:sz w:val="32"/>
           <w:szCs w:val="32"/>
         </w:rPr>
+        <w:lastRenderedPageBreak/>
         <w:t>Why Extension Is Better Than Helper Function:</w:t>
       </w:r>
     </w:p>
@@ -32868,7 +31858,6 @@
           <w:sz w:val="32"/>
           <w:szCs w:val="32"/>
         </w:rPr>
-        <w:lastRenderedPageBreak/>
         <w:t># We could do this:</w:t>
       </w:r>
     </w:p>
@@ -33488,6 +32477,7 @@
           <w:sz w:val="32"/>
           <w:szCs w:val="32"/>
         </w:rPr>
+        <w:lastRenderedPageBreak/>
         <w:t># Cleaner pipeline.</w:t>
       </w:r>
     </w:p>
@@ -34359,6 +33349,7 @@
           <w:sz w:val="32"/>
           <w:szCs w:val="32"/>
         </w:rPr>
+        <w:lastRenderedPageBreak/>
         <w:t>Problematic in large data systems and serialization-heavy apps</w:t>
       </w:r>
     </w:p>

</xml_diff>